<commit_message>
Proposal: final submitted version
Synchronize the proposal with the team-approved text: ACT policy, DANN-adapted
IDM, augmentation baseline, 80/10/10 episode split and member names.

Precision fixes: the 100 to 300 demonstration fallback is decided by the
cube-only pilot rather than the target oracle, and the pilot checks only the
IDM's source validation error, so target actions never select the budget.

Complete bibliography URLs and metadata, and keep the Word export's tables
compact for the proposal.
</commit_message>
<xml_diff>
--- a/docs/proposal/main.docx
+++ b/docs/proposal/main.docx
@@ -59,25 +59,25 @@
         <w:t xml:space="preserve"> </w:t>
       </w:r>
       <w:r>
-        <w:t xml:space="preserve">We teach a robot arm that manipulates one object to handle new ones from videos</w:t>
-      </w:r>
-      <w:r>
-        <w:t xml:space="preserve"> </w:t>
-      </w:r>
-      <w:r>
-        <w:t xml:space="preserve">alone: warehouse and home robots meet new items constantly, and recording paired</w:t>
-      </w:r>
-      <w:r>
-        <w:t xml:space="preserve"> </w:t>
-      </w:r>
-      <w:r>
-        <w:t xml:space="preserve">images and motor commands for each requires operating the robot. We study this in</w:t>
-      </w:r>
-      <w:r>
-        <w:t xml:space="preserve"> </w:t>
-      </w:r>
-      <w:r>
-        <w:t xml:space="preserve">OCBench simulation (UR5e arm, Robotiq gripper)</w:t>
+        <w:t xml:space="preserve">We teach a robot arm that manipulates one object to handle new ones from videos alone:</w:t>
+      </w:r>
+      <w:r>
+        <w:t xml:space="preserve"> </w:t>
+      </w:r>
+      <w:r>
+        <w:t xml:space="preserve">warehouse and home robots meet new items constantly, and recording paired images and</w:t>
+      </w:r>
+      <w:r>
+        <w:t xml:space="preserve"> </w:t>
+      </w:r>
+      <w:r>
+        <w:t xml:space="preserve">motor commands for each requires operating the robot. We study this in OCBench</w:t>
+      </w:r>
+      <w:r>
+        <w:t xml:space="preserve"> </w:t>
+      </w:r>
+      <w:r>
+        <w:t xml:space="preserve">simulation (UR5e arm, Robotiq gripper)</w:t>
       </w:r>
       <w:r>
         <w:t xml:space="preserve"> </w:t>
@@ -109,13 +109,19 @@
         <w:t xml:space="preserve"> </w:t>
       </w:r>
       <w:r>
-        <w:t xml:space="preserve">Visuomotor policies imitate images paired with motor commands, and such pairs are</w:t>
-      </w:r>
-      <w:r>
-        <w:t xml:space="preserve"> </w:t>
-      </w:r>
-      <w:r>
-        <w:t xml:space="preserve">costly: 76k teleoperated demonstrations took 50 people a year</w:t>
+        <w:t xml:space="preserve">Visuomotor policies imitate images paired with motor commands, and acquiring such pairs</w:t>
+      </w:r>
+      <w:r>
+        <w:t xml:space="preserve"> </w:t>
+      </w:r>
+      <w:r>
+        <w:t xml:space="preserve">across varying configurations is costly and time-consuming: 50 people took a year to</w:t>
+      </w:r>
+      <w:r>
+        <w:t xml:space="preserve"> </w:t>
+      </w:r>
+      <w:r>
+        <w:t xml:space="preserve">collect 76k teleoperated demonstrations</w:t>
       </w:r>
       <w:r>
         <w:t xml:space="preserve"> </w:t>
@@ -129,13 +135,25 @@
         </w:r>
       </w:hyperlink>
       <w:r>
-        <w:t xml:space="preserve">. Videos without commands are cheap (e.g., generated by</w:t>
-      </w:r>
-      <w:r>
-        <w:t xml:space="preserve"> </w:t>
-      </w:r>
-      <w:r>
-        <w:t xml:space="preserve">world models or video generation models</w:t>
+        <w:t xml:space="preserve">. With limited</w:t>
+      </w:r>
+      <w:r>
+        <w:t xml:space="preserve"> </w:t>
+      </w:r>
+      <w:r>
+        <w:t xml:space="preserve">training coverage, a policy may produce an erroneous action when it encounters an</w:t>
+      </w:r>
+      <w:r>
+        <w:t xml:space="preserve"> </w:t>
+      </w:r>
+      <w:r>
+        <w:t xml:space="preserve">unfamiliar situation. Errors can compound during execution, moving the robot further</w:t>
+      </w:r>
+      <w:r>
+        <w:t xml:space="preserve"> </w:t>
+      </w:r>
+      <w:r>
+        <w:t xml:space="preserve">from situations represented in its training data</w:t>
       </w:r>
       <w:r>
         <w:t xml:space="preserve"> </w:t>
@@ -149,13 +167,686 @@
         </w:r>
       </w:hyperlink>
       <w:r>
-        <w:t xml:space="preserve">). An inverse</w:t>
-      </w:r>
-      <w:r>
-        <w:t xml:space="preserve"> </w:t>
-      </w:r>
-      <w:r>
-        <w:t xml:space="preserve">dynamics model (IDM), trained on few labeled demonstrations</w:t>
+        <w:t xml:space="preserve">. We investigate</w:t>
+      </w:r>
+      <w:r>
+        <w:t xml:space="preserve"> </w:t>
+      </w:r>
+      <w:r>
+        <w:t xml:space="preserve">whether action-free videos can help pixel-to-action policies manipulate new objects</w:t>
+      </w:r>
+      <w:r>
+        <w:t xml:space="preserve"> </w:t>
+      </w:r>
+      <w:r>
+        <w:t xml:space="preserve">without collecting additional action labels for those objects.</w:t>
+      </w:r>
+    </w:p>
+    <w:p>
+      <w:pPr>
+        <w:pStyle w:val="Heading4"/>
+      </w:pPr>
+      <w:r>
+        <w:t xml:space="preserve">Constraints.</w:t>
+      </w:r>
+    </w:p>
+    <w:tbl>
+      <w:tblPr>
+        <w:tblStyle w:val="Table"/>
+        <w:tblW w:type="pct" w:w="5000"/>
+        <w:tblLayout w:type="fixed"/>
+        <w:tblLook w:firstRow="1" w:lastRow="0" w:firstColumn="0" w:lastColumn="0" w:noHBand="0" w:noVBand="0" w:val="0020"/>
+      </w:tblPr>
+      <w:tblGrid>
+        <w:gridCol w:w="508"/>
+        <w:gridCol w:w="1367"/>
+        <w:gridCol w:w="3975"/>
+        <w:gridCol w:w="2067"/>
+      </w:tblGrid>
+      <w:tr>
+        <w:trPr>
+          <w:tblHeader w:val="on"/>
+        </w:trPr>
+        <w:tc>
+          <w:tcPr>
+            <w:tcBorders>
+              <w:bottom w:val="single" w:sz="12" w:space="0" w:color="000000"/>
+            </w:tcBorders>
+          </w:tcPr>
+          <w:p>
+            <w:pPr>
+              <w:pStyle w:val="Compact"/>
+              <w:jc w:val="left"/>
+            </w:pPr>
+            <w:r>
+              <w:rPr>
+                <w:b/>
+                <w:bCs/>
+              </w:rPr>
+              <w:t xml:space="preserve">ID</w:t>
+            </w:r>
+          </w:p>
+        </w:tc>
+        <w:tc>
+          <w:tcPr>
+            <w:tcBorders>
+              <w:bottom w:val="single" w:sz="12" w:space="0" w:color="000000"/>
+            </w:tcBorders>
+          </w:tcPr>
+          <w:p>
+            <w:pPr>
+              <w:pStyle w:val="Compact"/>
+              <w:jc w:val="left"/>
+            </w:pPr>
+            <w:r>
+              <w:rPr>
+                <w:b/>
+                <w:bCs/>
+              </w:rPr>
+              <w:t xml:space="preserve">Requirement</w:t>
+            </w:r>
+          </w:p>
+        </w:tc>
+        <w:tc>
+          <w:tcPr>
+            <w:tcBorders>
+              <w:bottom w:val="single" w:sz="12" w:space="0" w:color="000000"/>
+            </w:tcBorders>
+          </w:tcPr>
+          <w:p>
+            <w:pPr>
+              <w:pStyle w:val="Compact"/>
+              <w:jc w:val="left"/>
+            </w:pPr>
+            <w:r>
+              <w:rPr>
+                <w:b/>
+                <w:bCs/>
+              </w:rPr>
+              <w:t xml:space="preserve">Definition</w:t>
+            </w:r>
+          </w:p>
+        </w:tc>
+        <w:tc>
+          <w:tcPr>
+            <w:tcBorders>
+              <w:bottom w:val="single" w:sz="12" w:space="0" w:color="000000"/>
+            </w:tcBorders>
+          </w:tcPr>
+          <w:p>
+            <w:pPr>
+              <w:pStyle w:val="Compact"/>
+              <w:jc w:val="left"/>
+            </w:pPr>
+            <w:r>
+              <w:rPr>
+                <w:b/>
+                <w:bCs/>
+              </w:rPr>
+              <w:t xml:space="preserve">Target</w:t>
+            </w:r>
+          </w:p>
+        </w:tc>
+      </w:tr>
+      <w:tr>
+        <w:tc>
+          <w:tcPr/>
+          <w:p>
+            <w:pPr>
+              <w:pStyle w:val="Compact"/>
+              <w:jc w:val="left"/>
+            </w:pPr>
+            <w:r>
+              <w:t xml:space="preserve">R1</w:t>
+            </w:r>
+          </w:p>
+        </w:tc>
+        <w:tc>
+          <w:tcPr/>
+          <w:p>
+            <w:pPr>
+              <w:pStyle w:val="Compact"/>
+              <w:jc w:val="left"/>
+            </w:pPr>
+            <w:r>
+              <w:t xml:space="preserve">Supervision</w:t>
+            </w:r>
+          </w:p>
+        </w:tc>
+        <w:tc>
+          <w:tcPr/>
+          <w:p>
+            <w:pPr>
+              <w:pStyle w:val="Compact"/>
+              <w:jc w:val="left"/>
+            </w:pPr>
+            <w:r>
+              <w:t xml:space="preserve">Target data are RGB frames only</w:t>
+            </w:r>
+          </w:p>
+        </w:tc>
+        <w:tc>
+          <w:tcPr/>
+          <w:p>
+            <w:pPr>
+              <w:pStyle w:val="Compact"/>
+              <w:jc w:val="left"/>
+            </w:pPr>
+            <w:r>
+              <w:t xml:space="preserve">Zero target labels</w:t>
+            </w:r>
+          </w:p>
+        </w:tc>
+      </w:tr>
+      <w:tr>
+        <w:tc>
+          <w:tcPr/>
+          <w:p>
+            <w:pPr>
+              <w:pStyle w:val="Compact"/>
+              <w:jc w:val="left"/>
+            </w:pPr>
+            <w:r>
+              <w:t xml:space="preserve">R2</w:t>
+            </w:r>
+          </w:p>
+        </w:tc>
+        <w:tc>
+          <w:tcPr/>
+          <w:p>
+            <w:pPr>
+              <w:pStyle w:val="Compact"/>
+              <w:jc w:val="left"/>
+            </w:pPr>
+            <w:r>
+              <w:t xml:space="preserve">Label budget</w:t>
+            </w:r>
+          </w:p>
+        </w:tc>
+        <w:tc>
+          <w:tcPr/>
+          <w:p>
+            <w:pPr>
+              <w:pStyle w:val="Compact"/>
+              <w:jc w:val="left"/>
+            </w:pPr>
+            <w:r>
+              <w:t xml:space="preserve">Labeled cube demonstrations, identical for every method</w:t>
+            </w:r>
+          </w:p>
+        </w:tc>
+        <w:tc>
+          <w:tcPr/>
+          <w:p>
+            <w:pPr>
+              <w:pStyle w:val="Compact"/>
+              <w:jc w:val="left"/>
+            </w:pPr>
+            <w:r>
+              <w:t xml:space="preserve">100</w:t>
+            </w:r>
+            <w:r>
+              <w:t xml:space="preserve"> </w:t>
+            </w:r>
+            <w:r>
+              <w:t xml:space="preserve">demos; 300 if cube-only ACT is below 80% in the source pilot</w:t>
+            </w:r>
+          </w:p>
+        </w:tc>
+      </w:tr>
+      <w:tr>
+        <w:tc>
+          <w:tcPr/>
+          <w:p>
+            <w:pPr>
+              <w:pStyle w:val="Compact"/>
+              <w:jc w:val="left"/>
+            </w:pPr>
+            <w:r>
+              <w:t xml:space="preserve">R3</w:t>
+            </w:r>
+          </w:p>
+        </w:tc>
+        <w:tc>
+          <w:tcPr/>
+          <w:p>
+            <w:pPr>
+              <w:pStyle w:val="Compact"/>
+              <w:jc w:val="left"/>
+            </w:pPr>
+            <w:r>
+              <w:t xml:space="preserve">Inputs</w:t>
+            </w:r>
+          </w:p>
+        </w:tc>
+        <w:tc>
+          <w:tcPr/>
+          <w:p>
+            <w:pPr>
+              <w:pStyle w:val="Compact"/>
+              <w:jc w:val="left"/>
+            </w:pPr>
+            <w:r>
+              <w:t xml:space="preserve">No simulator state in any learned model</w:t>
+            </w:r>
+          </w:p>
+        </w:tc>
+        <w:tc>
+          <w:tcPr/>
+          <w:p>
+            <w:pPr>
+              <w:pStyle w:val="Compact"/>
+              <w:jc w:val="left"/>
+            </w:pPr>
+            <w:r>
+              <w:t xml:space="preserve">Images only</w:t>
+            </w:r>
+          </w:p>
+        </w:tc>
+      </w:tr>
+      <w:tr>
+        <w:tc>
+          <w:tcPr/>
+          <w:p>
+            <w:pPr>
+              <w:pStyle w:val="Compact"/>
+              <w:jc w:val="left"/>
+            </w:pPr>
+            <w:r>
+              <w:t xml:space="preserve">R4</w:t>
+            </w:r>
+          </w:p>
+        </w:tc>
+        <w:tc>
+          <w:tcPr/>
+          <w:p>
+            <w:pPr>
+              <w:pStyle w:val="Compact"/>
+              <w:jc w:val="left"/>
+            </w:pPr>
+            <w:r>
+              <w:t xml:space="preserve">Target</w:t>
+            </w:r>
+          </w:p>
+        </w:tc>
+        <w:tc>
+          <w:tcPr/>
+          <w:p>
+            <w:pPr>
+              <w:pStyle w:val="Compact"/>
+              <w:jc w:val="left"/>
+            </w:pPr>
+            <w:r>
+              <w:t xml:space="preserve">Success gain over the cube-only policy on each target, as a fraction of the oracle’s gain</w:t>
+            </w:r>
+          </w:p>
+        </w:tc>
+        <w:tc>
+          <w:tcPr/>
+          <w:p>
+            <w:pPr>
+              <w:pStyle w:val="Compact"/>
+              <w:jc w:val="left"/>
+            </w:pPr>
+            <m:oMath>
+              <m:r>
+                <m:rPr>
+                  <m:sty m:val="p"/>
+                </m:rPr>
+                <m:t>≥</m:t>
+              </m:r>
+              <m:r>
+                <m:t>50</m:t>
+              </m:r>
+              <m:r>
+                <m:rPr>
+                  <m:sty m:val="p"/>
+                </m:rPr>
+                <m:t>%</m:t>
+              </m:r>
+            </m:oMath>
+            <w:r>
+              <w:t xml:space="preserve"> </w:t>
+            </w:r>
+            <w:r>
+              <w:t xml:space="preserve">of gap</w:t>
+            </w:r>
+          </w:p>
+        </w:tc>
+      </w:tr>
+      <w:tr>
+        <w:tc>
+          <w:tcPr/>
+          <w:p>
+            <w:pPr>
+              <w:pStyle w:val="Compact"/>
+              <w:jc w:val="left"/>
+            </w:pPr>
+            <w:r>
+              <w:t xml:space="preserve">R5</w:t>
+            </w:r>
+          </w:p>
+        </w:tc>
+        <w:tc>
+          <w:tcPr/>
+          <w:p>
+            <w:pPr>
+              <w:pStyle w:val="Compact"/>
+              <w:jc w:val="left"/>
+            </w:pPr>
+            <w:r>
+              <w:t xml:space="preserve">Retention</w:t>
+            </w:r>
+          </w:p>
+        </w:tc>
+        <w:tc>
+          <w:tcPr/>
+          <w:p>
+            <w:pPr>
+              <w:pStyle w:val="Compact"/>
+              <w:jc w:val="left"/>
+            </w:pPr>
+            <w:r>
+              <w:t xml:space="preserve">Drop in cube success after adding target data</w:t>
+            </w:r>
+          </w:p>
+        </w:tc>
+        <w:tc>
+          <w:tcPr/>
+          <w:p>
+            <w:pPr>
+              <w:pStyle w:val="Compact"/>
+              <w:jc w:val="left"/>
+            </w:pPr>
+            <m:oMath>
+              <m:r>
+                <m:rPr>
+                  <m:sty m:val="p"/>
+                </m:rPr>
+                <m:t>≤</m:t>
+              </m:r>
+              <m:r>
+                <m:t>10</m:t>
+              </m:r>
+            </m:oMath>
+            <w:r>
+              <w:t xml:space="preserve"> </w:t>
+            </w:r>
+            <w:r>
+              <w:t xml:space="preserve">points</w:t>
+            </w:r>
+          </w:p>
+        </w:tc>
+      </w:tr>
+      <w:tr>
+        <w:tc>
+          <w:tcPr/>
+          <w:p>
+            <w:pPr>
+              <w:pStyle w:val="Compact"/>
+              <w:jc w:val="left"/>
+            </w:pPr>
+            <w:r>
+              <w:t xml:space="preserve">R6</w:t>
+            </w:r>
+          </w:p>
+        </w:tc>
+        <w:tc>
+          <w:tcPr/>
+          <w:p>
+            <w:pPr>
+              <w:pStyle w:val="Compact"/>
+              <w:jc w:val="left"/>
+            </w:pPr>
+            <w:r>
+              <w:t xml:space="preserve">Real time</w:t>
+            </w:r>
+          </w:p>
+        </w:tc>
+        <w:tc>
+          <w:tcPr/>
+          <w:p>
+            <w:pPr>
+              <w:pStyle w:val="Compact"/>
+              <w:jc w:val="left"/>
+            </w:pPr>
+            <w:r>
+              <w:t xml:space="preserve">Policy inference per call, completed within one 25-action chunk at 50 Hz, so it can run while the previous chunk executes (IDM offline)</w:t>
+            </w:r>
+          </w:p>
+        </w:tc>
+        <w:tc>
+          <w:tcPr/>
+          <w:p>
+            <w:pPr>
+              <w:pStyle w:val="Compact"/>
+              <w:jc w:val="left"/>
+            </w:pPr>
+            <m:oMath>
+              <m:r>
+                <m:rPr>
+                  <m:sty m:val="p"/>
+                </m:rPr>
+                <m:t>&lt;</m:t>
+              </m:r>
+              <m:r>
+                <m:t>0.5</m:t>
+              </m:r>
+            </m:oMath>
+            <w:r>
+              <w:t xml:space="preserve"> </w:t>
+            </w:r>
+            <w:r>
+              <w:t xml:space="preserve">s</w:t>
+            </w:r>
+          </w:p>
+        </w:tc>
+      </w:tr>
+    </w:tbl>
+    <w:p>
+      <w:pPr>
+        <w:pStyle w:val="Heading1"/>
+      </w:pPr>
+      <w:r>
+        <w:t xml:space="preserve">Aims/Goals</w:t>
+      </w:r>
+    </w:p>
+    <w:p>
+      <w:pPr>
+        <w:pStyle w:val="FirstParagraph"/>
+      </w:pPr>
+      <w:r>
+        <w:rPr>
+          <w:b/>
+          <w:bCs/>
+        </w:rPr>
+        <w:t xml:space="preserve">Goals.</w:t>
+      </w:r>
+      <w:r>
+        <w:t xml:space="preserve"> </w:t>
+      </w:r>
+      <w:r>
+        <w:t xml:space="preserve">Meet R4 and R5 on each target, satisfy R1–R3 by design, and measure R6.</w:t>
+      </w:r>
+    </w:p>
+    <w:p>
+      <w:pPr>
+        <w:pStyle w:val="BodyText"/>
+      </w:pPr>
+      <w:r>
+        <w:rPr>
+          <w:b/>
+          <w:bCs/>
+        </w:rPr>
+        <w:t xml:space="preserve">Scope.</w:t>
+      </w:r>
+      <w:r>
+        <w:t xml:space="preserve"> </w:t>
+      </w:r>
+      <w:r>
+        <w:t xml:space="preserve">We study an alternative data-gathering method in simulation, evaluating three target</w:t>
+      </w:r>
+      <w:r>
+        <w:t xml:space="preserve"> </w:t>
+      </w:r>
+      <w:r>
+        <w:t xml:space="preserve">objects and an optional fourth; real robots are unavailable. We use OCBench’s visual</w:t>
+      </w:r>
+      <w:r>
+        <w:t xml:space="preserve"> </w:t>
+      </w:r>
+      <w:r>
+        <w:t xml:space="preserve">single-block task with its default</w:t>
+      </w:r>
+      <w:r>
+        <w:t xml:space="preserve"> </w:t>
+      </w:r>
+      <m:oMath>
+        <m:r>
+          <m:t>6</m:t>
+        </m:r>
+        <m:r>
+          <m:rPr>
+            <m:sty m:val="p"/>
+          </m:rPr>
+          <m:t>×</m:t>
+        </m:r>
+        <m:r>
+          <m:t>6</m:t>
+        </m:r>
+        <m:r>
+          <m:rPr>
+            <m:sty m:val="p"/>
+          </m:rPr>
+          <m:t>×</m:t>
+        </m:r>
+        <m:r>
+          <m:t>6</m:t>
+        </m:r>
+      </m:oMath>
+      <w:r>
+        <w:t xml:space="preserve"> </w:t>
+      </w:r>
+      <w:r>
+        <w:t xml:space="preserve">cm red cube as source. Targets</w:t>
+      </w:r>
+      <w:r>
+        <w:t xml:space="preserve"> </w:t>
+      </w:r>
+      <w:r>
+        <w:t xml:space="preserve">are (A) a blue cube of identical size (appearance), (B) a</w:t>
+      </w:r>
+      <w:r>
+        <w:t xml:space="preserve"> </w:t>
+      </w:r>
+      <m:oMath>
+        <m:r>
+          <m:t>9</m:t>
+        </m:r>
+        <m:r>
+          <m:rPr>
+            <m:sty m:val="p"/>
+          </m:rPr>
+          <m:t>×</m:t>
+        </m:r>
+        <m:r>
+          <m:t>6</m:t>
+        </m:r>
+        <m:r>
+          <m:rPr>
+            <m:sty m:val="p"/>
+          </m:rPr>
+          <m:t>×</m:t>
+        </m:r>
+        <m:r>
+          <m:t>6</m:t>
+        </m:r>
+      </m:oMath>
+      <w:r>
+        <w:t xml:space="preserve"> </w:t>
+      </w:r>
+      <w:r>
+        <w:t xml:space="preserve">cm red</w:t>
+      </w:r>
+      <w:r>
+        <w:t xml:space="preserve"> </w:t>
+      </w:r>
+      <w:r>
+        <w:t xml:space="preserve">block (geometry, same grasp width), (C) a</w:t>
+      </w:r>
+      <w:r>
+        <w:t xml:space="preserve"> </w:t>
+      </w:r>
+      <m:oMath>
+        <m:r>
+          <m:t>9</m:t>
+        </m:r>
+        <m:r>
+          <m:rPr>
+            <m:sty m:val="p"/>
+          </m:rPr>
+          <m:t>×</m:t>
+        </m:r>
+        <m:r>
+          <m:t>7</m:t>
+        </m:r>
+        <m:r>
+          <m:rPr>
+            <m:sty m:val="p"/>
+          </m:rPr>
+          <m:t>×</m:t>
+        </m:r>
+        <m:r>
+          <m:t>6</m:t>
+        </m:r>
+      </m:oMath>
+      <w:r>
+        <w:t xml:space="preserve"> </w:t>
+      </w:r>
+      <w:r>
+        <w:t xml:space="preserve">cm red block (geometry</w:t>
+      </w:r>
+      <w:r>
+        <w:t xml:space="preserve"> </w:t>
+      </w:r>
+      <w:r>
+        <w:t xml:space="preserve">and grasp width), and optionally (D) a blue version of C (combined). Expert grasps are</w:t>
+      </w:r>
+      <w:r>
+        <w:t xml:space="preserve"> </w:t>
+      </w:r>
+      <w:r>
+        <w:t xml:space="preserve">adapted; robots, cameras, lighting, and tasks stay fixed. Human videos and large</w:t>
+      </w:r>
+      <w:r>
+        <w:t xml:space="preserve"> </w:t>
+      </w:r>
+      <w:r>
+        <w:t xml:space="preserve">pretrained models are out of scope.</w:t>
+      </w:r>
+    </w:p>
+    <w:p>
+      <w:pPr>
+        <w:pStyle w:val="BodyText"/>
+      </w:pPr>
+      <w:r>
+        <w:rPr>
+          <w:b/>
+          <w:bCs/>
+        </w:rPr>
+        <w:t xml:space="preserve">Proposed solution.</w:t>
+      </w:r>
+      <w:r>
+        <w:t xml:space="preserve"> </w:t>
+      </w:r>
+      <w:r>
+        <w:t xml:space="preserve">World models and video generation models could provide demonstrations without action</w:t>
+      </w:r>
+      <w:r>
+        <w:t xml:space="preserve"> </w:t>
+      </w:r>
+      <w:r>
+        <w:t xml:space="preserve">labels</w:t>
       </w:r>
       <w:r>
         <w:t xml:space="preserve"> </w:t>
@@ -169,13 +860,25 @@
         </w:r>
       </w:hyperlink>
       <w:r>
-        <w:t xml:space="preserve">, infers the command between consecutive frames and</w:t>
-      </w:r>
-      <w:r>
-        <w:t xml:space="preserve"> </w:t>
-      </w:r>
-      <w:r>
-        <w:t xml:space="preserve">labels such videos for imitation</w:t>
+        <w:t xml:space="preserve">. In this project, we use simulator-generated videos of</w:t>
+      </w:r>
+      <w:r>
+        <w:t xml:space="preserve"> </w:t>
+      </w:r>
+      <w:r>
+        <w:t xml:space="preserve">new objects to evaluate learning from action-free demonstrations in a controlled</w:t>
+      </w:r>
+      <w:r>
+        <w:t xml:space="preserve"> </w:t>
+      </w:r>
+      <w:r>
+        <w:t xml:space="preserve">setting. We feed consecutive frames into an inverse dynamics model (IDM), trained on few</w:t>
+      </w:r>
+      <w:r>
+        <w:t xml:space="preserve"> </w:t>
+      </w:r>
+      <w:r>
+        <w:t xml:space="preserve">labeled cube demonstrations</w:t>
       </w:r>
       <w:r>
         <w:t xml:space="preserve"> </w:t>
@@ -189,7 +892,13 @@
         </w:r>
       </w:hyperlink>
       <w:r>
-        <w:t xml:space="preserve">,</w:t>
+        <w:t xml:space="preserve">, and infer actions for imitation</w:t>
+      </w:r>
+      <w:r>
+        <w:t xml:space="preserve"> </w:t>
+      </w:r>
+      <w:r>
+        <w:t xml:space="preserve">learning</w:t>
       </w:r>
       <w:r>
         <w:t xml:space="preserve"> </w:t>
@@ -203,7 +912,21 @@
         </w:r>
       </w:hyperlink>
       <w:r>
-        <w:t xml:space="preserve">. Here the target videos show new objects, unlike the IDM’s training data. Formally, given labeled cube transitions</w:t>
+        <w:t xml:space="preserve">,</w:t>
+      </w:r>
+      <w:r>
+        <w:t xml:space="preserve"> </w:t>
+      </w:r>
+      <w:hyperlink w:anchor="ref_7">
+        <w:r>
+          <w:rPr>
+            <w:rStyle w:val="Hyperlink"/>
+          </w:rPr>
+          <w:t xml:space="preserve">[7]</w:t>
+        </w:r>
+      </w:hyperlink>
+      <w:r>
+        <w:t xml:space="preserve">. Formally, given cube transitions</w:t>
       </w:r>
       <w:r>
         <w:t xml:space="preserve"> </w:t>
@@ -409,843 +1132,54 @@
         <w:t xml:space="preserve"> </w:t>
       </w:r>
       <w:r>
-        <w:t xml:space="preserve">that</w:t>
-      </w:r>
-      <w:r>
-        <w:t xml:space="preserve"> </w:t>
-      </w:r>
-      <w:r>
-        <w:t xml:space="preserve">succeeds on the new objects under R1–R6.</w:t>
-      </w:r>
-    </w:p>
-    <w:p>
-      <w:pPr>
-        <w:pStyle w:val="BodyText"/>
-      </w:pPr>
-      <w:r>
-        <w:rPr>
-          <w:b/>
-          <w:bCs/>
-        </w:rPr>
-        <w:t xml:space="preserve">Constraints.</w:t>
-      </w:r>
-      <w:r>
-        <w:t xml:space="preserve"> </w:t>
-      </w:r>
-      <w:r>
-        <w:rPr>
-          <w:rStyle w:val="TeamNote"/>
-        </w:rPr>
-        <w:t xml:space="preserve">Red values are still to be agreed.</w:t>
-      </w:r>
-    </w:p>
-    <w:tbl>
-      <w:tblPr>
-        <w:tblStyle w:val="Table"/>
-        <w:tblW w:type="pct" w:w="5000"/>
-        <w:tblLayout w:type="fixed"/>
-        <w:tblLook w:firstRow="1" w:lastRow="0" w:firstColumn="0" w:lastColumn="0" w:noHBand="0" w:noVBand="0" w:val="0020"/>
-      </w:tblPr>
-      <w:tblGrid>
-        <w:gridCol w:w="613"/>
-        <w:gridCol w:w="1227"/>
-        <w:gridCol w:w="4666"/>
-        <w:gridCol w:w="1412"/>
-      </w:tblGrid>
-      <w:tr>
-        <w:trPr>
-          <w:tblHeader w:val="on"/>
-        </w:trPr>
-        <w:tc>
-          <w:tcPr>
-            <w:tcBorders>
-              <w:bottom w:val="single" w:sz="12" w:space="0" w:color="000000"/>
-            </w:tcBorders>
-          </w:tcPr>
-          <w:p>
-            <w:pPr>
-              <w:pStyle w:val="Compact"/>
-              <w:jc w:val="left"/>
-            </w:pPr>
-            <w:r>
-              <w:rPr>
-                <w:b/>
-                <w:bCs/>
-              </w:rPr>
-              <w:t xml:space="preserve">ID</w:t>
-            </w:r>
-          </w:p>
-        </w:tc>
-        <w:tc>
-          <w:tcPr>
-            <w:tcBorders>
-              <w:bottom w:val="single" w:sz="12" w:space="0" w:color="000000"/>
-            </w:tcBorders>
-          </w:tcPr>
-          <w:p>
-            <w:pPr>
-              <w:pStyle w:val="Compact"/>
-              <w:jc w:val="left"/>
-            </w:pPr>
-            <w:r>
-              <w:rPr>
-                <w:b/>
-                <w:bCs/>
-              </w:rPr>
-              <w:t xml:space="preserve">Requirement</w:t>
-            </w:r>
-          </w:p>
-        </w:tc>
-        <w:tc>
-          <w:tcPr>
-            <w:tcBorders>
-              <w:bottom w:val="single" w:sz="12" w:space="0" w:color="000000"/>
-            </w:tcBorders>
-          </w:tcPr>
-          <w:p>
-            <w:pPr>
-              <w:pStyle w:val="Compact"/>
-              <w:jc w:val="left"/>
-            </w:pPr>
-            <w:r>
-              <w:rPr>
-                <w:b/>
-                <w:bCs/>
-              </w:rPr>
-              <w:t xml:space="preserve">Definition</w:t>
-            </w:r>
-          </w:p>
-        </w:tc>
-        <w:tc>
-          <w:tcPr>
-            <w:tcBorders>
-              <w:bottom w:val="single" w:sz="12" w:space="0" w:color="000000"/>
-            </w:tcBorders>
-          </w:tcPr>
-          <w:p>
-            <w:pPr>
-              <w:pStyle w:val="Compact"/>
-              <w:jc w:val="left"/>
-            </w:pPr>
-            <w:r>
-              <w:rPr>
-                <w:b/>
-                <w:bCs/>
-              </w:rPr>
-              <w:t xml:space="preserve">Target</w:t>
-            </w:r>
-          </w:p>
-        </w:tc>
-      </w:tr>
-      <w:tr>
-        <w:tc>
-          <w:tcPr/>
-          <w:p>
-            <w:pPr>
-              <w:pStyle w:val="Compact"/>
-              <w:jc w:val="left"/>
-            </w:pPr>
-            <w:r>
-              <w:t xml:space="preserve">R1</w:t>
-            </w:r>
-          </w:p>
-        </w:tc>
-        <w:tc>
-          <w:tcPr/>
-          <w:p>
-            <w:pPr>
-              <w:pStyle w:val="Compact"/>
-              <w:jc w:val="left"/>
-            </w:pPr>
-            <w:r>
-              <w:t xml:space="preserve">Supervision</w:t>
-            </w:r>
-          </w:p>
-        </w:tc>
-        <w:tc>
-          <w:tcPr/>
-          <w:p>
-            <w:pPr>
-              <w:pStyle w:val="Compact"/>
-              <w:jc w:val="left"/>
-            </w:pPr>
-            <w:r>
-              <w:t xml:space="preserve">Target data are RGB frames only</w:t>
-            </w:r>
-          </w:p>
-        </w:tc>
-        <w:tc>
-          <w:tcPr/>
-          <w:p>
-            <w:pPr>
-              <w:pStyle w:val="Compact"/>
-              <w:jc w:val="left"/>
-            </w:pPr>
-            <w:r>
-              <w:t xml:space="preserve">Zero target labels</w:t>
-            </w:r>
-          </w:p>
-        </w:tc>
-      </w:tr>
-      <w:tr>
-        <w:tc>
-          <w:tcPr/>
-          <w:p>
-            <w:pPr>
-              <w:pStyle w:val="Compact"/>
-              <w:jc w:val="left"/>
-            </w:pPr>
-            <w:r>
-              <w:t xml:space="preserve">R2</w:t>
-            </w:r>
-          </w:p>
-        </w:tc>
-        <w:tc>
-          <w:tcPr/>
-          <w:p>
-            <w:pPr>
-              <w:pStyle w:val="Compact"/>
-              <w:jc w:val="left"/>
-            </w:pPr>
-            <w:r>
-              <w:t xml:space="preserve">Label budget</w:t>
-            </w:r>
-          </w:p>
-        </w:tc>
-        <w:tc>
-          <w:tcPr/>
-          <w:p>
-            <w:pPr>
-              <w:pStyle w:val="Compact"/>
-              <w:jc w:val="left"/>
-            </w:pPr>
-            <w:r>
-              <w:t xml:space="preserve">Labeled cube demonstrations, identical for every method</w:t>
-            </w:r>
-          </w:p>
-        </w:tc>
-        <w:tc>
-          <w:tcPr/>
-          <w:p>
-            <w:pPr>
-              <w:pStyle w:val="Compact"/>
-              <w:jc w:val="left"/>
-            </w:pPr>
-            <w:r>
-              <w:rPr>
-                <w:rStyle w:val="TeamNote"/>
-              </w:rPr>
-              <w:t xml:space="preserve">300</w:t>
-            </w:r>
-            <w:r>
-              <w:t xml:space="preserve"> </w:t>
-            </w:r>
-            <w:r>
-              <w:t xml:space="preserve">demos</w:t>
-            </w:r>
-          </w:p>
-        </w:tc>
-      </w:tr>
-      <w:tr>
-        <w:tc>
-          <w:tcPr/>
-          <w:p>
-            <w:pPr>
-              <w:pStyle w:val="Compact"/>
-              <w:jc w:val="left"/>
-            </w:pPr>
-            <w:r>
-              <w:t xml:space="preserve">R3</w:t>
-            </w:r>
-          </w:p>
-        </w:tc>
-        <w:tc>
-          <w:tcPr/>
-          <w:p>
-            <w:pPr>
-              <w:pStyle w:val="Compact"/>
-              <w:jc w:val="left"/>
-            </w:pPr>
-            <w:r>
-              <w:t xml:space="preserve">Inputs</w:t>
-            </w:r>
-          </w:p>
-        </w:tc>
-        <w:tc>
-          <w:tcPr/>
-          <w:p>
-            <w:pPr>
-              <w:pStyle w:val="Compact"/>
-              <w:jc w:val="left"/>
-            </w:pPr>
-            <w:r>
-              <w:t xml:space="preserve">No simulator state in any learned model</w:t>
-            </w:r>
-          </w:p>
-        </w:tc>
-        <w:tc>
-          <w:tcPr/>
-          <w:p>
-            <w:pPr>
-              <w:pStyle w:val="Compact"/>
-              <w:jc w:val="left"/>
-            </w:pPr>
-            <w:r>
-              <w:t xml:space="preserve">Images only</w:t>
-            </w:r>
-          </w:p>
-        </w:tc>
-      </w:tr>
-      <w:tr>
-        <w:tc>
-          <w:tcPr/>
-          <w:p>
-            <w:pPr>
-              <w:pStyle w:val="Compact"/>
-              <w:jc w:val="left"/>
-            </w:pPr>
-            <w:r>
-              <w:t xml:space="preserve">R4</w:t>
-            </w:r>
-          </w:p>
-        </w:tc>
-        <w:tc>
-          <w:tcPr/>
-          <w:p>
-            <w:pPr>
-              <w:pStyle w:val="Compact"/>
-              <w:jc w:val="left"/>
-            </w:pPr>
-            <w:r>
-              <w:t xml:space="preserve">Target</w:t>
-            </w:r>
-          </w:p>
-        </w:tc>
-        <w:tc>
-          <w:tcPr/>
-          <w:p>
-            <w:pPr>
-              <w:pStyle w:val="Compact"/>
-              <w:jc w:val="left"/>
-            </w:pPr>
-            <w:r>
-              <w:t xml:space="preserve">Success gain over the cube-only policy on each target, as a fraction of the oracle’s gain</w:t>
-            </w:r>
-          </w:p>
-        </w:tc>
-        <w:tc>
-          <w:tcPr/>
-          <w:p>
-            <w:pPr>
-              <w:pStyle w:val="Compact"/>
-              <w:jc w:val="left"/>
-            </w:pPr>
-            <m:oMath>
-              <m:r>
-                <m:rPr>
-                  <m:sty m:val="p"/>
-                </m:rPr>
-                <m:t>≥</m:t>
-              </m:r>
-            </m:oMath>
-            <w:r>
-              <w:t xml:space="preserve"> </w:t>
-            </w:r>
-            <w:r>
-              <w:rPr>
-                <w:rStyle w:val="TeamNote"/>
-              </w:rPr>
-              <w:t xml:space="preserve">50%</w:t>
-            </w:r>
-            <w:r>
-              <w:t xml:space="preserve"> </w:t>
-            </w:r>
-            <w:r>
-              <w:t xml:space="preserve">of gap</w:t>
-            </w:r>
-          </w:p>
-        </w:tc>
-      </w:tr>
-      <w:tr>
-        <w:tc>
-          <w:tcPr/>
-          <w:p>
-            <w:pPr>
-              <w:pStyle w:val="Compact"/>
-              <w:jc w:val="left"/>
-            </w:pPr>
-            <w:r>
-              <w:t xml:space="preserve">R5</w:t>
-            </w:r>
-          </w:p>
-        </w:tc>
-        <w:tc>
-          <w:tcPr/>
-          <w:p>
-            <w:pPr>
-              <w:pStyle w:val="Compact"/>
-              <w:jc w:val="left"/>
-            </w:pPr>
-            <w:r>
-              <w:t xml:space="preserve">Retention</w:t>
-            </w:r>
-          </w:p>
-        </w:tc>
-        <w:tc>
-          <w:tcPr/>
-          <w:p>
-            <w:pPr>
-              <w:pStyle w:val="Compact"/>
-              <w:jc w:val="left"/>
-            </w:pPr>
-            <w:r>
-              <w:t xml:space="preserve">Drop in cube success after adding target data</w:t>
-            </w:r>
-          </w:p>
-        </w:tc>
-        <w:tc>
-          <w:tcPr/>
-          <w:p>
-            <w:pPr>
-              <w:pStyle w:val="Compact"/>
-              <w:jc w:val="left"/>
-            </w:pPr>
-            <m:oMath>
-              <m:r>
-                <m:rPr>
-                  <m:sty m:val="p"/>
-                </m:rPr>
-                <m:t>≤</m:t>
-              </m:r>
-            </m:oMath>
-            <w:r>
-              <w:t xml:space="preserve"> </w:t>
-            </w:r>
-            <w:r>
-              <w:rPr>
-                <w:rStyle w:val="TeamNote"/>
-              </w:rPr>
-              <w:t xml:space="preserve">10</w:t>
-            </w:r>
-            <w:r>
-              <w:t xml:space="preserve"> </w:t>
-            </w:r>
-            <w:r>
-              <w:t xml:space="preserve">points</w:t>
-            </w:r>
-          </w:p>
-        </w:tc>
-      </w:tr>
-      <w:tr>
-        <w:tc>
-          <w:tcPr/>
-          <w:p>
-            <w:pPr>
-              <w:pStyle w:val="Compact"/>
-              <w:jc w:val="left"/>
-            </w:pPr>
-            <w:r>
-              <w:t xml:space="preserve">R6</w:t>
-            </w:r>
-          </w:p>
-        </w:tc>
-        <w:tc>
-          <w:tcPr/>
-          <w:p>
-            <w:pPr>
-              <w:pStyle w:val="Compact"/>
-              <w:jc w:val="left"/>
-            </w:pPr>
-            <w:r>
-              <w:t xml:space="preserve">Real time</w:t>
-            </w:r>
-          </w:p>
-        </w:tc>
-        <w:tc>
-          <w:tcPr/>
-          <w:p>
-            <w:pPr>
-              <w:pStyle w:val="Compact"/>
-              <w:jc w:val="left"/>
-            </w:pPr>
-            <w:r>
-              <w:t xml:space="preserve">Policy inference per call, within one 50 Hz control step (IDM offline)</w:t>
-            </w:r>
-          </w:p>
-        </w:tc>
-        <w:tc>
-          <w:tcPr/>
-          <w:p>
-            <w:pPr>
-              <w:pStyle w:val="Compact"/>
-              <w:jc w:val="left"/>
-            </w:pPr>
-            <m:oMath>
-              <m:r>
-                <m:rPr>
-                  <m:sty m:val="p"/>
-                </m:rPr>
-                <m:t>&lt;</m:t>
-              </m:r>
-            </m:oMath>
-            <w:r>
-              <w:t xml:space="preserve"> </w:t>
-            </w:r>
-            <w:r>
-              <w:rPr>
-                <w:rStyle w:val="TeamNote"/>
-              </w:rPr>
-              <w:t xml:space="preserve">20</w:t>
-            </w:r>
-            <w:r>
-              <w:t xml:space="preserve"> ms</w:t>
-            </w:r>
-          </w:p>
-        </w:tc>
-      </w:tr>
-    </w:tbl>
-    <w:p>
-      <w:pPr>
-        <w:pStyle w:val="Heading1"/>
-      </w:pPr>
-      <w:r>
-        <w:t xml:space="preserve">Aims/Goals</w:t>
-      </w:r>
-    </w:p>
-    <w:p>
-      <w:pPr>
-        <w:pStyle w:val="FirstParagraph"/>
-      </w:pPr>
-      <w:r>
-        <w:rPr>
-          <w:b/>
-          <w:bCs/>
-        </w:rPr>
-        <w:t xml:space="preserve">Goals.</w:t>
-      </w:r>
-      <w:r>
-        <w:t xml:space="preserve"> </w:t>
-      </w:r>
-      <w:r>
-        <w:t xml:space="preserve">Meet R4 and R5 on each new object with an image-only policy trained on cube</w:t>
-      </w:r>
-      <w:r>
-        <w:t xml:space="preserve"> </w:t>
-      </w:r>
-      <w:r>
-        <w:t xml:space="preserve">demonstrations and action-free target videos; R1–R3 hold by design and R6 is</w:t>
-      </w:r>
-      <w:r>
-        <w:t xml:space="preserve"> </w:t>
-      </w:r>
-      <w:r>
-        <w:t xml:space="preserve">measured.</w:t>
-      </w:r>
-    </w:p>
-    <w:p>
-      <w:pPr>
-        <w:pStyle w:val="BodyText"/>
-      </w:pPr>
-      <w:r>
-        <w:rPr>
-          <w:b/>
-          <w:bCs/>
-        </w:rPr>
-        <w:t xml:space="preserve">Scope.</w:t>
-      </w:r>
-      <w:r>
-        <w:t xml:space="preserve"> </w:t>
-      </w:r>
-      <w:r>
-        <w:t xml:space="preserve">We use OCBench’s visual single-block task; the source is its default</w:t>
-      </w:r>
-      <w:r>
-        <w:t xml:space="preserve"> </w:t>
-      </w:r>
-      <m:oMath>
-        <m:r>
-          <m:t>6</m:t>
-        </m:r>
-        <m:r>
-          <m:rPr>
-            <m:sty m:val="p"/>
-          </m:rPr>
-          <m:t>×</m:t>
-        </m:r>
-        <m:r>
-          <m:t>6</m:t>
-        </m:r>
-        <m:r>
-          <m:rPr>
-            <m:sty m:val="p"/>
-          </m:rPr>
-          <m:t>×</m:t>
-        </m:r>
-        <m:r>
-          <m:t>6</m:t>
-        </m:r>
-      </m:oMath>
-      <w:r>
-        <w:t xml:space="preserve"> cm red cube.</w:t>
-      </w:r>
-      <w:r>
-        <w:t xml:space="preserve"> </w:t>
-      </w:r>
-      <w:r>
-        <w:rPr>
-          <w:rStyle w:val="TeamReview"/>
-        </w:rPr>
-        <w:t xml:space="preserve">The targets separate the factors: (A) a</w:t>
-      </w:r>
-      <w:r>
-        <w:rPr>
-          <w:rStyle w:val="TeamReview"/>
-        </w:rPr>
-        <w:t xml:space="preserve"> </w:t>
-      </w:r>
-      <m:oMath>
-        <m:r>
-          <m:t>6</m:t>
-        </m:r>
-        <m:r>
-          <m:rPr>
-            <m:sty m:val="p"/>
-          </m:rPr>
-          <m:t>×</m:t>
-        </m:r>
-        <m:r>
-          <m:t>6</m:t>
-        </m:r>
-        <m:r>
-          <m:rPr>
-            <m:sty m:val="p"/>
-          </m:rPr>
-          <m:t>×</m:t>
-        </m:r>
-        <m:r>
-          <m:t>6</m:t>
-        </m:r>
-      </m:oMath>
-      <w:r>
-        <w:rPr>
-          <w:rStyle w:val="TeamReview"/>
-        </w:rPr>
-        <w:t xml:space="preserve"> cm blue cube (appearance only), (B) a</w:t>
-      </w:r>
-      <w:r>
-        <w:rPr>
-          <w:rStyle w:val="TeamReview"/>
-        </w:rPr>
-        <w:t xml:space="preserve"> </w:t>
-      </w:r>
-      <m:oMath>
-        <m:r>
-          <m:t>9</m:t>
-        </m:r>
-        <m:r>
-          <m:rPr>
-            <m:sty m:val="p"/>
-          </m:rPr>
-          <m:t>×</m:t>
-        </m:r>
-        <m:r>
-          <m:t>6</m:t>
-        </m:r>
-        <m:r>
-          <m:rPr>
-            <m:sty m:val="p"/>
-          </m:rPr>
-          <m:t>×</m:t>
-        </m:r>
-        <m:r>
-          <m:t>6</m:t>
-        </m:r>
-      </m:oMath>
-      <w:r>
-        <w:rPr>
-          <w:rStyle w:val="TeamReview"/>
-        </w:rPr>
-        <w:t xml:space="preserve"> cm red block (geometry, same grasp width), (C) a</w:t>
-      </w:r>
-      <w:r>
-        <w:rPr>
-          <w:rStyle w:val="TeamReview"/>
-        </w:rPr>
-        <w:t xml:space="preserve"> </w:t>
-      </w:r>
-      <m:oMath>
-        <m:r>
-          <m:t>9</m:t>
-        </m:r>
-        <m:r>
-          <m:rPr>
-            <m:sty m:val="p"/>
-          </m:rPr>
-          <m:t>×</m:t>
-        </m:r>
-        <m:r>
-          <m:t>7</m:t>
-        </m:r>
-        <m:r>
-          <m:rPr>
-            <m:sty m:val="p"/>
-          </m:rPr>
-          <m:t>×</m:t>
-        </m:r>
-        <m:r>
-          <m:t>6</m:t>
-        </m:r>
-      </m:oMath>
-      <w:r>
-        <w:rPr>
-          <w:rStyle w:val="TeamReview"/>
-        </w:rPr>
-        <w:t xml:space="preserve"> cm red block (geometry and grasp width), and, optionally,</w:t>
-      </w:r>
-      <w:r>
-        <w:rPr>
-          <w:rStyle w:val="TeamReview"/>
-        </w:rPr>
-        <w:t xml:space="preserve"> </w:t>
-      </w:r>
-      <w:r>
-        <w:rPr>
-          <w:rStyle w:val="TeamReview"/>
-        </w:rPr>
-        <w:t xml:space="preserve">(D) a</w:t>
-      </w:r>
-      <w:r>
-        <w:rPr>
-          <w:rStyle w:val="TeamReview"/>
-        </w:rPr>
-        <w:t xml:space="preserve"> </w:t>
-      </w:r>
-      <m:oMath>
-        <m:r>
-          <m:t>9</m:t>
-        </m:r>
-        <m:r>
-          <m:rPr>
-            <m:sty m:val="p"/>
-          </m:rPr>
-          <m:t>×</m:t>
-        </m:r>
-        <m:r>
-          <m:t>7</m:t>
-        </m:r>
-        <m:r>
-          <m:rPr>
-            <m:sty m:val="p"/>
-          </m:rPr>
-          <m:t>×</m:t>
-        </m:r>
-        <m:r>
-          <m:t>6</m:t>
-        </m:r>
-      </m:oMath>
-      <w:r>
-        <w:rPr>
-          <w:rStyle w:val="TeamReview"/>
-        </w:rPr>
-        <w:t xml:space="preserve"> cm blue block (all combined).</w:t>
-      </w:r>
-      <w:r>
-        <w:t xml:space="preserve"> </w:t>
-      </w:r>
-      <w:r>
-        <w:t xml:space="preserve">Expert grasps are</w:t>
-      </w:r>
-      <w:r>
-        <w:t xml:space="preserve"> </w:t>
-      </w:r>
-      <w:r>
-        <w:t xml:space="preserve">adapted to each; robot, cameras, lighting, and task stay fixed. Human videos,</w:t>
-      </w:r>
-      <w:r>
-        <w:t xml:space="preserve"> </w:t>
-      </w:r>
-      <w:r>
-        <w:t xml:space="preserve">real hardware, and large pretrained models are out of scope.</w:t>
-      </w:r>
-    </w:p>
-    <w:p>
-      <w:pPr>
-        <w:pStyle w:val="BodyText"/>
-      </w:pPr>
-      <w:r>
-        <w:rPr>
-          <w:b/>
-          <w:bCs/>
-        </w:rPr>
-        <w:t xml:space="preserve">Proposed solution.</w:t>
-      </w:r>
-      <w:r>
-        <w:t xml:space="preserve"> </w:t>
-      </w:r>
-      <w:r>
-        <w:t xml:space="preserve">We adapt the IDM to each target before labeling its videos. The IDM sees frame differences, which emphasize the unchanged arm, and</w:t>
-      </w:r>
-      <w:r>
-        <w:t xml:space="preserve"> </w:t>
-      </w:r>
-      <w:r>
-        <w:t xml:space="preserve">domain-adversarial training</w:t>
-      </w:r>
-      <w:r>
-        <w:t xml:space="preserve"> </w:t>
-      </w:r>
-      <w:hyperlink w:anchor="ref_7">
+        <w:t xml:space="preserve">satisfying R1–R6.</w:t>
+      </w:r>
+      <w:r>
+        <w:t xml:space="preserve"> </w:t>
+      </w:r>
+      <w:r>
+        <w:t xml:space="preserve">We adapt the IDM to each target before labeling its videos, using frame differences for</w:t>
+      </w:r>
+      <w:r>
+        <w:t xml:space="preserve"> </w:t>
+      </w:r>
+      <w:r>
+        <w:t xml:space="preserve">motion cues and DANN</w:t>
+      </w:r>
+      <w:r>
+        <w:t xml:space="preserve"> </w:t>
+      </w:r>
+      <w:hyperlink w:anchor="ref_8">
         <w:r>
           <w:rPr>
             <w:rStyle w:val="Hyperlink"/>
           </w:rPr>
-          <w:t xml:space="preserve">[7]</w:t>
+          <w:t xml:space="preserve">[8]</w:t>
         </w:r>
       </w:hyperlink>
       <w:r>
         <w:t xml:space="preserve"> </w:t>
       </w:r>
       <w:r>
-        <w:t xml:space="preserve">makes its features</w:t>
-      </w:r>
-      <w:r>
-        <w:t xml:space="preserve"> </w:t>
-      </w:r>
-      <w:r>
-        <w:t xml:space="preserve">indistinguishable between cube and target frames while still predicting cube</w:t>
-      </w:r>
-      <w:r>
-        <w:t xml:space="preserve"> </w:t>
-      </w:r>
-      <w:r>
-        <w:t xml:space="preserve">actions. One policy per target then trains on cube demonstrations plus pseudo-labeled</w:t>
-      </w:r>
-      <w:r>
-        <w:t xml:space="preserve"> </w:t>
-      </w:r>
-      <w:r>
-        <w:t xml:space="preserve">target videos.</w:t>
-      </w:r>
-      <w:r>
-        <w:t xml:space="preserve"> </w:t>
-      </w:r>
-      <w:r>
-        <w:rPr>
-          <w:rStyle w:val="TeamReview"/>
-        </w:rPr>
-        <w:t xml:space="preserve">Adaptation should help most on A, whose</w:t>
-      </w:r>
-      <w:r>
-        <w:rPr>
-          <w:rStyle w:val="TeamReview"/>
-        </w:rPr>
-        <w:t xml:space="preserve"> </w:t>
-      </w:r>
-      <w:r>
-        <w:rPr>
-          <w:rStyle w:val="TeamReview"/>
-        </w:rPr>
-        <w:t xml:space="preserve">actions match the cube’s.</w:t>
+        <w:t xml:space="preserve">to encourage domain-invariant features while</w:t>
+      </w:r>
+      <w:r>
+        <w:t xml:space="preserve"> </w:t>
+      </w:r>
+      <w:r>
+        <w:t xml:space="preserve">still predicting cube actions. One ACT policy per target then trains on cube</w:t>
+      </w:r>
+      <w:r>
+        <w:t xml:space="preserve"> </w:t>
+      </w:r>
+      <w:r>
+        <w:t xml:space="preserve">demonstrations plus pseudo-labeled target videos. Adaptation should help most on A,</w:t>
+      </w:r>
+      <w:r>
+        <w:t xml:space="preserve"> </w:t>
+      </w:r>
+      <w:r>
+        <w:t xml:space="preserve">where only appearance changes.</w:t>
       </w:r>
     </w:p>
     <w:p>
@@ -1271,15 +1205,9 @@
         <w:t xml:space="preserve"> </w:t>
       </w:r>
       <w:r>
-        <w:rPr>
-          <w:rStyle w:val="TeamReview"/>
-        </w:rPr>
         <w:t xml:space="preserve">Observations are</w:t>
       </w:r>
       <w:r>
-        <w:rPr>
-          <w:rStyle w:val="TeamReview"/>
-        </w:rPr>
         <w:t xml:space="preserve"> </w:t>
       </w:r>
       <m:oMath>
@@ -1297,186 +1225,50 @@
         </m:r>
       </m:oMath>
       <w:r>
-        <w:rPr>
-          <w:rStyle w:val="TeamReview"/>
-        </w:rPr>
-        <w:t xml:space="preserve"> </w:t>
-      </w:r>
-      <w:r>
-        <w:rPr>
-          <w:rStyle w:val="TeamReview"/>
-        </w:rPr>
-        <w:t xml:space="preserve">images from the front, side, and wrist</w:t>
-      </w:r>
-      <w:r>
-        <w:rPr>
-          <w:rStyle w:val="TeamReview"/>
-        </w:rPr>
-        <w:t xml:space="preserve"> </w:t>
-      </w:r>
-      <w:r>
-        <w:rPr>
-          <w:rStyle w:val="TeamReview"/>
-        </w:rPr>
-        <w:t xml:space="preserve">cameras; actions are seven normalized joint and gripper increments at 50 Hz. The</w:t>
-      </w:r>
-      <w:r>
-        <w:rPr>
-          <w:rStyle w:val="TeamReview"/>
-        </w:rPr>
-        <w:t xml:space="preserve"> </w:t>
-      </w:r>
-      <w:r>
-        <w:rPr>
-          <w:rStyle w:val="TeamReview"/>
-        </w:rPr>
-        <w:t xml:space="preserve">IDM’s convolutional encoder, shared across cameras, embeds</w:t>
-      </w:r>
-      <w:r>
-        <w:rPr>
-          <w:rStyle w:val="TeamReview"/>
-        </w:rPr>
-        <w:t xml:space="preserve"> </w:t>
-      </w:r>
-      <m:oMath>
-        <m:sSub>
-          <m:e>
-            <m:r>
-              <m:t>o</m:t>
-            </m:r>
-          </m:e>
-          <m:sub>
-            <m:r>
-              <m:t>t</m:t>
-            </m:r>
-          </m:sub>
-        </m:sSub>
-      </m:oMath>
-      <w:r>
-        <w:rPr>
-          <w:rStyle w:val="TeamReview"/>
-        </w:rPr>
-        <w:t xml:space="preserve">,</w:t>
-      </w:r>
-      <w:r>
-        <w:rPr>
-          <w:rStyle w:val="TeamReview"/>
-        </w:rPr>
-        <w:t xml:space="preserve"> </w:t>
-      </w:r>
-      <m:oMath>
-        <m:sSub>
-          <m:e>
-            <m:r>
-              <m:t>o</m:t>
-            </m:r>
-          </m:e>
-          <m:sub>
-            <m:r>
-              <m:t>t</m:t>
-            </m:r>
-            <m:r>
-              <m:rPr>
-                <m:sty m:val="p"/>
-              </m:rPr>
-              <m:t>+</m:t>
-            </m:r>
-            <m:r>
-              <m:t>1</m:t>
-            </m:r>
-          </m:sub>
-        </m:sSub>
-      </m:oMath>
-      <w:r>
-        <w:rPr>
-          <w:rStyle w:val="TeamReview"/>
-        </w:rPr>
-        <w:t xml:space="preserve">, and</w:t>
-      </w:r>
-      <w:r>
-        <w:rPr>
-          <w:rStyle w:val="TeamReview"/>
-        </w:rPr>
-        <w:t xml:space="preserve"> </w:t>
-      </w:r>
-      <w:r>
-        <w:rPr>
-          <w:rStyle w:val="TeamReview"/>
-        </w:rPr>
-        <w:t xml:space="preserve">their difference, and an MLP regresses</w:t>
-      </w:r>
-      <w:r>
-        <w:rPr>
-          <w:rStyle w:val="TeamReview"/>
-        </w:rPr>
-        <w:t xml:space="preserve"> </w:t>
-      </w:r>
-      <m:oMath>
-        <m:sSub>
-          <m:e>
-            <m:r>
-              <m:t>a</m:t>
-            </m:r>
-          </m:e>
-          <m:sub>
-            <m:r>
-              <m:t>t</m:t>
-            </m:r>
-          </m:sub>
-        </m:sSub>
-      </m:oMath>
-      <w:r>
-        <w:rPr>
-          <w:rStyle w:val="TeamReview"/>
-        </w:rPr>
-        <w:t xml:space="preserve"> </w:t>
-      </w:r>
-      <w:r>
-        <w:rPr>
-          <w:rStyle w:val="TeamReview"/>
-        </w:rPr>
-        <w:t xml:space="preserve">with mean squared error. A</w:t>
-      </w:r>
-      <w:r>
-        <w:rPr>
-          <w:rStyle w:val="TeamReview"/>
-        </w:rPr>
-        <w:t xml:space="preserve"> </w:t>
-      </w:r>
-      <w:r>
-        <w:rPr>
-          <w:rStyle w:val="TeamReview"/>
-        </w:rPr>
-        <w:t xml:space="preserve">discriminator classifies these features as cube or target (binary</w:t>
-      </w:r>
-      <w:r>
-        <w:rPr>
-          <w:rStyle w:val="TeamReview"/>
-        </w:rPr>
-        <w:t xml:space="preserve"> </w:t>
-      </w:r>
-      <w:r>
-        <w:rPr>
-          <w:rStyle w:val="TeamReview"/>
-        </w:rPr>
-        <w:t xml:space="preserve">cross-entropy); a gradient reversal layer returns its gradient to the encoder</w:t>
-      </w:r>
-      <w:r>
-        <w:rPr>
-          <w:rStyle w:val="TeamReview"/>
-        </w:rPr>
-        <w:t xml:space="preserve"> </w:t>
-      </w:r>
-      <w:r>
-        <w:rPr>
-          <w:rStyle w:val="TeamReview"/>
-        </w:rPr>
-        <w:t xml:space="preserve">with flipped sign, scaled by a weight</w:t>
-      </w:r>
-      <w:r>
-        <w:rPr>
-          <w:rStyle w:val="TeamReview"/>
-        </w:rPr>
+        <w:t xml:space="preserve"> </w:t>
+      </w:r>
+      <w:r>
+        <w:t xml:space="preserve">RGB images from the front, side, and wrist cameras;</w:t>
+      </w:r>
+      <w:r>
+        <w:t xml:space="preserve"> </w:t>
+      </w:r>
+      <w:r>
+        <w:t xml:space="preserve">actions are seven normalized joint and gripper increments at 50 Hz. The IDM uses a</w:t>
+      </w:r>
+      <w:r>
+        <w:t xml:space="preserve"> </w:t>
+      </w:r>
+      <w:r>
+        <w:t xml:space="preserve">convolutional encoder shared across cameras to embed consecutive frames and their</w:t>
+      </w:r>
+      <w:r>
+        <w:t xml:space="preserve"> </w:t>
+      </w:r>
+      <w:r>
+        <w:t xml:space="preserve">difference, followed by an MLP trained with action mean squared error. Following DANN</w:t>
+      </w:r>
+      <w:r>
+        <w:t xml:space="preserve"> </w:t>
+      </w:r>
+      <w:hyperlink w:anchor="ref_8">
+        <w:r>
+          <w:rPr>
+            <w:rStyle w:val="Hyperlink"/>
+          </w:rPr>
+          <w:t xml:space="preserve">[8]</w:t>
+        </w:r>
+      </w:hyperlink>
+      <w:r>
+        <w:t xml:space="preserve">, a domain discriminator is trained with binary cross-entropy</w:t>
+      </w:r>
+      <w:r>
+        <w:t xml:space="preserve"> </w:t>
+      </w:r>
+      <w:r>
+        <w:t xml:space="preserve">through a gradient reversal layer, whose reversed gradient is scaled by a weight</w:t>
+      </w:r>
+      <w:r>
         <w:t xml:space="preserve"> </w:t>
       </w:r>
       <m:oMath>
@@ -1485,21 +1277,18 @@
         </m:r>
       </m:oMath>
       <w:r>
-        <w:rPr>
-          <w:rStyle w:val="TeamReview"/>
-        </w:rPr>
-        <w:t xml:space="preserve"> </w:t>
-      </w:r>
-      <w:r>
-        <w:rPr>
-          <w:rStyle w:val="TeamReview"/>
-        </w:rPr>
-        <w:t xml:space="preserve">that ramps up as in DANN;</w:t>
-      </w:r>
-      <w:r>
-        <w:rPr>
-          <w:rStyle w:val="TeamReview"/>
-        </w:rPr>
+        <w:t xml:space="preserve"> </w:t>
+      </w:r>
+      <w:r>
+        <w:t xml:space="preserve">that ramps up during training. The IDM retains its supervised source</w:t>
+      </w:r>
+      <w:r>
+        <w:t xml:space="preserve"> </w:t>
+      </w:r>
+      <w:r>
+        <w:t xml:space="preserve">action-prediction loss;</w:t>
+      </w:r>
+      <w:r>
         <w:t xml:space="preserve"> </w:t>
       </w:r>
       <m:oMath>
@@ -1517,122 +1306,54 @@
         </m:r>
       </m:oMath>
       <w:r>
-        <w:rPr>
-          <w:rStyle w:val="TeamReview"/>
-        </w:rPr>
-        <w:t xml:space="preserve"> </w:t>
-      </w:r>
-      <w:r>
-        <w:rPr>
-          <w:rStyle w:val="TeamReview"/>
-        </w:rPr>
-        <w:t xml:space="preserve">gives the unadapted IDM. The policy shares the encoder, takes</w:t>
-      </w:r>
-      <w:r>
-        <w:rPr>
-          <w:rStyle w:val="TeamReview"/>
-        </w:rPr>
-        <w:t xml:space="preserve"> </w:t>
-      </w:r>
-      <m:oMath>
-        <m:sSub>
-          <m:e>
-            <m:r>
-              <m:t>o</m:t>
-            </m:r>
-          </m:e>
-          <m:sub>
-            <m:r>
-              <m:t>t</m:t>
-            </m:r>
-          </m:sub>
-        </m:sSub>
-      </m:oMath>
-      <w:r>
-        <w:rPr>
-          <w:rStyle w:val="TeamReview"/>
-        </w:rPr>
-        <w:t xml:space="preserve">,</w:t>
-      </w:r>
-      <w:r>
-        <w:rPr>
-          <w:rStyle w:val="TeamReview"/>
-        </w:rPr>
-        <w:t xml:space="preserve"> </w:t>
-      </w:r>
-      <w:r>
-        <w:rPr>
-          <w:rStyle w:val="TeamReview"/>
-        </w:rPr>
-        <w:t xml:space="preserve">and is trained with flow matching to predict the next</w:t>
-      </w:r>
-      <w:r>
-        <w:rPr>
-          <w:rStyle w:val="TeamReview"/>
-        </w:rPr>
-        <w:t xml:space="preserve"> </w:t>
-      </w:r>
-      <w:r>
-        <w:rPr>
-          <w:rStyle w:val="TeamNote"/>
-        </w:rPr>
-        <w:t xml:space="preserve">25</w:t>
-      </w:r>
-      <w:r>
-        <w:rPr>
-          <w:rStyle w:val="TeamReview"/>
-        </w:rPr>
-        <w:t xml:space="preserve"> </w:t>
-      </w:r>
-      <w:r>
-        <w:rPr>
-          <w:rStyle w:val="TeamReview"/>
-        </w:rPr>
-        <w:t xml:space="preserve">actions, executed</w:t>
-      </w:r>
-      <w:r>
-        <w:rPr>
-          <w:rStyle w:val="TeamReview"/>
-        </w:rPr>
-        <w:t xml:space="preserve"> </w:t>
-      </w:r>
-      <w:r>
-        <w:rPr>
-          <w:rStyle w:val="TeamReview"/>
-        </w:rPr>
-        <w:t xml:space="preserve">open loop as in OCBench</w:t>
-      </w:r>
-      <w:r>
-        <w:rPr>
-          <w:rStyle w:val="TeamReview"/>
-        </w:rPr>
-        <w:t xml:space="preserve"> </w:t>
-      </w:r>
-      <w:hyperlink w:anchor="ref_1">
+        <w:t xml:space="preserve"> </w:t>
+      </w:r>
+      <w:r>
+        <w:t xml:space="preserve">gives the unadapted IDM. The policy is an</w:t>
+      </w:r>
+      <w:r>
+        <w:t xml:space="preserve"> </w:t>
+      </w:r>
+      <w:r>
+        <w:t xml:space="preserve">image-only adaptation of ACT</w:t>
+      </w:r>
+      <w:r>
+        <w:t xml:space="preserve"> </w:t>
+      </w:r>
+      <w:hyperlink w:anchor="ref_3">
         <w:r>
           <w:rPr>
             <w:rStyle w:val="Hyperlink"/>
           </w:rPr>
-          <w:t xml:space="preserve">[1]</w:t>
+          <w:t xml:space="preserve">[3]</w:t>
         </w:r>
       </w:hyperlink>
       <w:r>
-        <w:rPr>
-          <w:rStyle w:val="TeamReview"/>
-        </w:rPr>
-        <w:t xml:space="preserve">. All methods share encoder, data, and</w:t>
-      </w:r>
-      <w:r>
-        <w:rPr>
-          <w:rStyle w:val="TeamReview"/>
-        </w:rPr>
-        <w:t xml:space="preserve"> </w:t>
-      </w:r>
-      <w:r>
-        <w:rPr>
-          <w:rStyle w:val="TeamReview"/>
-        </w:rPr>
-        <w:t xml:space="preserve">budget (PyTorch).</w:t>
+        <w:t xml:space="preserve">, excluding joint-position inputs and</w:t>
+      </w:r>
+      <w:r>
+        <w:t xml:space="preserve"> </w:t>
+      </w:r>
+      <w:r>
+        <w:t xml:space="preserve">predicting chunks of 25 action increments. It is trained as a conditional VAE with L1</w:t>
+      </w:r>
+      <w:r>
+        <w:t xml:space="preserve"> </w:t>
+      </w:r>
+      <w:r>
+        <w:t xml:space="preserve">reconstruction and KL-divergence losses. Chunks are executed open loop without temporal</w:t>
+      </w:r>
+      <w:r>
+        <w:t xml:space="preserve"> </w:t>
+      </w:r>
+      <w:r>
+        <w:t xml:space="preserve">ensembling. IDM and policy encoder weights are separate. All policy comparisons use the</w:t>
+      </w:r>
+      <w:r>
+        <w:t xml:space="preserve"> </w:t>
+      </w:r>
+      <w:r>
+        <w:t xml:space="preserve">same ACT architecture and training budget in PyTorch.</w:t>
       </w:r>
     </w:p>
     <w:p>
@@ -1650,15 +1371,15 @@
         <w:t xml:space="preserve"> </w:t>
       </w:r>
       <w:r>
-        <w:rPr>
-          <w:rStyle w:val="TeamReview"/>
-        </w:rPr>
-        <w:t xml:space="preserve">Splits are made by episode. Target actions never select models: the</w:t>
-      </w:r>
-      <w:r>
-        <w:rPr>
-          <w:rStyle w:val="TeamReview"/>
-        </w:rPr>
+        <w:t xml:space="preserve">Demonstrations are split by episode into 80% training, 10% validation, and 10% test,</w:t>
+      </w:r>
+      <w:r>
+        <w:t xml:space="preserve"> </w:t>
+      </w:r>
+      <w:r>
+        <w:t xml:space="preserve">with identical splits across methods. Target actions never select models:</w:t>
+      </w:r>
+      <w:r>
         <w:t xml:space="preserve"> </w:t>
       </w:r>
       <m:oMath>
@@ -1667,52 +1388,64 @@
         </m:r>
       </m:oMath>
       <w:r>
-        <w:rPr>
-          <w:rStyle w:val="TeamReview"/>
-        </w:rPr>
-        <w:t xml:space="preserve"> </w:t>
-      </w:r>
-      <w:r>
-        <w:rPr>
-          <w:rStyle w:val="TeamReview"/>
-        </w:rPr>
-        <w:t xml:space="preserve">schedule is fixed in advance, IDM checkpoints follow source validation</w:t>
-      </w:r>
-      <w:r>
-        <w:rPr>
-          <w:rStyle w:val="TeamReview"/>
-        </w:rPr>
-        <w:t xml:space="preserve"> </w:t>
-      </w:r>
-      <w:r>
-        <w:rPr>
-          <w:rStyle w:val="TeamReview"/>
-        </w:rPr>
-        <w:t xml:space="preserve">error, and policies train for a fixed number of steps. We report target success,</w:t>
-      </w:r>
-      <w:r>
-        <w:rPr>
-          <w:rStyle w:val="TeamReview"/>
-        </w:rPr>
-        <w:t xml:space="preserve"> </w:t>
-      </w:r>
-      <w:r>
-        <w:rPr>
-          <w:rStyle w:val="TeamReview"/>
-        </w:rPr>
-        <w:t xml:space="preserve">cube retention, per-component IDM error, and latency over three seeds and 100</w:t>
-      </w:r>
-      <w:r>
-        <w:rPr>
-          <w:rStyle w:val="TeamReview"/>
-        </w:rPr>
-        <w:t xml:space="preserve"> </w:t>
-      </w:r>
-      <w:r>
-        <w:rPr>
-          <w:rStyle w:val="TeamReview"/>
-        </w:rPr>
-        <w:t xml:space="preserve">episodes per method and object, with identical initial states.</w:t>
+        <w:t xml:space="preserve"> </w:t>
+      </w:r>
+      <w:r>
+        <w:t xml:space="preserve">is</w:t>
+      </w:r>
+      <w:r>
+        <w:t xml:space="preserve"> </w:t>
+      </w:r>
+      <w:r>
+        <w:t xml:space="preserve">prescheduled, IDM checkpoints follow source validation error, and policy training steps</w:t>
+      </w:r>
+      <w:r>
+        <w:t xml:space="preserve"> </w:t>
+      </w:r>
+      <w:r>
+        <w:t xml:space="preserve">are fixed. Across three seeds, we report per-component IDM error on held-out test</w:t>
+      </w:r>
+      <w:r>
+        <w:t xml:space="preserve"> </w:t>
+      </w:r>
+      <w:r>
+        <w:t xml:space="preserve">transitions, policy inference latency, and target success and cube retention over 100</w:t>
+      </w:r>
+      <w:r>
+        <w:t xml:space="preserve"> </w:t>
+      </w:r>
+      <w:r>
+        <w:t xml:space="preserve">separate evaluation rollouts per seed, method, and object, with identical initial states</w:t>
+      </w:r>
+      <w:r>
+        <w:t xml:space="preserve"> </w:t>
+      </w:r>
+      <w:r>
+        <w:t xml:space="preserve">across methods. We compare ACT policies using (a) cube-only data, (b) unadapted IDM</w:t>
+      </w:r>
+      <w:r>
+        <w:t xml:space="preserve"> </w:t>
+      </w:r>
+      <w:r>
+        <w:t xml:space="preserve">labels, (c) DANN-adapted IDM labels, (d) true target actions, and (e) cube-only</w:t>
+      </w:r>
+      <w:r>
+        <w:t xml:space="preserve"> </w:t>
+      </w:r>
+      <w:r>
+        <w:t xml:space="preserve">augmentation; optionally, (f) adds policy-encoder alignment to (b). Target actions</w:t>
+      </w:r>
+      <w:r>
+        <w:t xml:space="preserve"> </w:t>
+      </w:r>
+      <w:r>
+        <w:t xml:space="preserve">otherwise serve only post-training evaluation. R4 is inconclusive if (d)’s success does</w:t>
+      </w:r>
+      <w:r>
+        <w:t xml:space="preserve"> </w:t>
+      </w:r>
+      <w:r>
+        <w:t xml:space="preserve">not exceed (a)’s.</w:t>
       </w:r>
     </w:p>
     <w:p>
@@ -1730,46 +1463,43 @@
         <w:t xml:space="preserve"> </w:t>
       </w:r>
       <w:r>
-        <w:rPr>
-          <w:rStyle w:val="TeamReview"/>
-        </w:rPr>
-        <w:t xml:space="preserve">We compare (a) a cube-only behavioral cloning policy, (b) an unadapted</w:t>
-      </w:r>
-      <w:r>
-        <w:rPr>
-          <w:rStyle w:val="TeamReview"/>
-        </w:rPr>
-        <w:t xml:space="preserve"> </w:t>
-      </w:r>
-      <w:r>
-        <w:rPr>
-          <w:rStyle w:val="TeamReview"/>
-        </w:rPr>
-        <w:t xml:space="preserve">IDM, (c) our adversarial IDM, and (d) an oracle trained with true target actions;</w:t>
-      </w:r>
-      <w:r>
-        <w:rPr>
-          <w:rStyle w:val="TeamReview"/>
-        </w:rPr>
-        <w:t xml:space="preserve"> </w:t>
-      </w:r>
-      <w:r>
-        <w:rPr>
-          <w:rStyle w:val="TeamReview"/>
-        </w:rPr>
-        <w:t xml:space="preserve">optionally, (e) applies the alignment to the policy encoder instead. (b) versus</w:t>
-      </w:r>
-      <w:r>
-        <w:rPr>
-          <w:rStyle w:val="TeamReview"/>
-        </w:rPr>
-        <w:t xml:space="preserve"> </w:t>
-      </w:r>
-      <w:r>
-        <w:rPr>
-          <w:rStyle w:val="TeamReview"/>
-        </w:rPr>
-        <w:t xml:space="preserve">(c) isolates adaptation; (a) and (d) anchor R4.</w:t>
+        <w:t xml:space="preserve">Methods (b)–(d) also use cube demonstrations; (b) and (c) share augmentation settings.</w:t>
+      </w:r>
+      <w:r>
+        <w:t xml:space="preserve"> </w:t>
+      </w:r>
+      <w:r>
+        <w:t xml:space="preserve">Comparing (b)/(c) isolates IDM adaptation; (e)/(c) tests gains over strong source-only</w:t>
+      </w:r>
+      <w:r>
+        <w:t xml:space="preserve"> </w:t>
+      </w:r>
+      <w:r>
+        <w:t xml:space="preserve">augmentation; (a)/(d) anchor R4. Method (e) uses hue, brightness, contrast, and</w:t>
+      </w:r>
+      <w:r>
+        <w:t xml:space="preserve"> </w:t>
+      </w:r>
+      <w:r>
+        <w:t xml:space="preserve">saturation jitter and small random crops. We expect it to be competitive on A; B and C</w:t>
+      </w:r>
+      <w:r>
+        <w:t xml:space="preserve"> </w:t>
+      </w:r>
+      <w:r>
+        <w:t xml:space="preserve">test geometry and grasp-width changes these augmentations do not directly reproduce. We</w:t>
+      </w:r>
+      <w:r>
+        <w:t xml:space="preserve"> </w:t>
+      </w:r>
+      <w:r>
+        <w:t xml:space="preserve">hypothesize that (c) improves pseudo-label accuracy and policy success over (b), while</w:t>
+      </w:r>
+      <w:r>
+        <w:t xml:space="preserve"> </w:t>
+      </w:r>
+      <w:r>
+        <w:t xml:space="preserve">testing for negative transfer.</w:t>
       </w:r>
     </w:p>
     <w:p>
@@ -1795,130 +1525,49 @@
         <w:t xml:space="preserve"> </w:t>
       </w:r>
       <w:r>
-        <w:t xml:space="preserve">We generate all data in OCBench with MuJoCo:</w:t>
-      </w:r>
-      <w:r>
-        <w:t xml:space="preserve"> </w:t>
-      </w:r>
-      <w:r>
-        <w:rPr>
-          <w:rStyle w:val="TeamNote"/>
-        </w:rPr>
-        <w:t xml:space="preserve">300</w:t>
-      </w:r>
-      <w:r>
-        <w:t xml:space="preserve"> </w:t>
-      </w:r>
-      <w:r>
-        <w:t xml:space="preserve">labeled cube demonstrations</w:t>
-      </w:r>
-      <w:r>
-        <w:t xml:space="preserve"> </w:t>
-      </w:r>
-      <w:r>
-        <w:t xml:space="preserve">and</w:t>
-      </w:r>
-      <w:r>
-        <w:t xml:space="preserve"> </w:t>
-      </w:r>
-      <w:r>
-        <w:rPr>
-          <w:rStyle w:val="TeamNote"/>
-        </w:rPr>
-        <w:t xml:space="preserve">200</w:t>
-      </w:r>
-      <w:r>
-        <w:t xml:space="preserve"> </w:t>
-      </w:r>
-      <w:r>
-        <w:t xml:space="preserve">action-free videos per target, keeping true target actions only for</w:t>
-      </w:r>
-      <w:r>
-        <w:t xml:space="preserve"> </w:t>
-      </w:r>
-      <w:r>
-        <w:t xml:space="preserve">evaluation and the oracle; no licensing or ethics constraints apply. Training</w:t>
-      </w:r>
-      <w:r>
-        <w:t xml:space="preserve"> </w:t>
-      </w:r>
-      <w:r>
-        <w:t xml:space="preserve">uses one NVIDIA A10G GPU; the pilot estimates compute.</w:t>
-      </w:r>
-      <w:r>
-        <w:t xml:space="preserve"> </w:t>
-      </w:r>
-      <w:r>
-        <w:rPr>
-          <w:rStyle w:val="TeamReview"/>
-        </w:rPr>
-        <w:t xml:space="preserve">A pilot by</w:t>
-      </w:r>
-      <w:r>
-        <w:rPr>
-          <w:rStyle w:val="TeamReview"/>
-        </w:rPr>
-        <w:t xml:space="preserve"> </w:t>
-      </w:r>
-      <w:r>
-        <w:rPr>
-          <w:rStyle w:val="TeamNote"/>
-        </w:rPr>
-        <w:t xml:space="preserve">October 21</w:t>
-      </w:r>
-      <w:r>
-        <w:rPr>
-          <w:rStyle w:val="TeamReview"/>
-        </w:rPr>
-        <w:t xml:space="preserve"> </w:t>
-      </w:r>
-      <w:r>
-        <w:rPr>
-          <w:rStyle w:val="TeamReview"/>
-        </w:rPr>
-        <w:t xml:space="preserve">checks expert success and, on the cube and each target, the</w:t>
-      </w:r>
-      <w:r>
-        <w:rPr>
-          <w:rStyle w:val="TeamReview"/>
-        </w:rPr>
-        <w:t xml:space="preserve"> </w:t>
-      </w:r>
-      <w:r>
-        <w:rPr>
-          <w:rStyle w:val="TeamReview"/>
-        </w:rPr>
-        <w:t xml:space="preserve">cube-only policy’s success and the IDM’s error.</w:t>
-      </w:r>
-      <w:r>
-        <w:t xml:space="preserve"> </w:t>
-      </w:r>
-      <w:r>
-        <w:t xml:space="preserve">Core methods follow by</w:t>
-      </w:r>
-      <w:r>
-        <w:t xml:space="preserve"> </w:t>
-      </w:r>
-      <w:r>
-        <w:rPr>
-          <w:rStyle w:val="TeamNote"/>
-        </w:rPr>
-        <w:t xml:space="preserve">November 1</w:t>
-      </w:r>
-      <w:r>
-        <w:t xml:space="preserve">; evaluation by</w:t>
-      </w:r>
-      <w:r>
-        <w:t xml:space="preserve"> </w:t>
-      </w:r>
-      <w:r>
-        <w:rPr>
-          <w:rStyle w:val="TeamNote"/>
-        </w:rPr>
-        <w:t xml:space="preserve">November 18</w:t>
-      </w:r>
-      <w:r>
-        <w:t xml:space="preserve">.</w:t>
+        <w:t xml:space="preserve">We generate all data in OCBench with MuJoCo: 100 labeled cube demonstrations (300 if</w:t>
+      </w:r>
+      <w:r>
+        <w:t xml:space="preserve"> </w:t>
+      </w:r>
+      <w:r>
+        <w:t xml:space="preserve">cube-only ACT scores below 80% in separate cube-validation rollouts; the budget and</w:t>
+      </w:r>
+      <w:r>
+        <w:t xml:space="preserve"> </w:t>
+      </w:r>
+      <w:r>
+        <w:t xml:space="preserve">split ratios are fixed before any comparison) and 200 action-free videos per target,</w:t>
+      </w:r>
+      <w:r>
+        <w:t xml:space="preserve"> </w:t>
+      </w:r>
+      <w:r>
+        <w:t xml:space="preserve">keeping true target actions only for evaluation and the oracle; no licensing or ethics</w:t>
+      </w:r>
+      <w:r>
+        <w:t xml:space="preserve"> </w:t>
+      </w:r>
+      <w:r>
+        <w:t xml:space="preserve">constraints apply. Training uses one NVIDIA A10G GPU; the pilot estimates compute. A</w:t>
+      </w:r>
+      <w:r>
+        <w:t xml:space="preserve"> </w:t>
+      </w:r>
+      <w:r>
+        <w:t xml:space="preserve">pilot by October 21 checks expert success, the cube-only policy’s success on the cube</w:t>
+      </w:r>
+      <w:r>
+        <w:t xml:space="preserve"> </w:t>
+      </w:r>
+      <w:r>
+        <w:t xml:space="preserve">and each target, and the IDM’s source validation error. Core methods follow by November</w:t>
+      </w:r>
+      <w:r>
+        <w:t xml:space="preserve"> </w:t>
+      </w:r>
+      <w:r>
+        <w:t xml:space="preserve">1; evaluation by November 18.</w:t>
       </w:r>
     </w:p>
     <w:p>
@@ -1944,93 +1593,45 @@
         <w:t xml:space="preserve"> </w:t>
       </w:r>
       <w:r>
-        <w:rPr>
-          <w:rStyle w:val="TeamReview"/>
-        </w:rPr>
-        <w:t xml:space="preserve">Adversarial training aligns feature distributions, not the</w:t>
-      </w:r>
-      <w:r>
-        <w:rPr>
-          <w:rStyle w:val="TeamReview"/>
-        </w:rPr>
-        <w:t xml:space="preserve"> </w:t>
-      </w:r>
-      <w:r>
-        <w:rPr>
-          <w:rStyle w:val="TeamReview"/>
-        </w:rPr>
-        <w:t xml:space="preserve">action each feature maps to</w:t>
-      </w:r>
-      <w:r>
-        <w:rPr>
-          <w:rStyle w:val="TeamReview"/>
-        </w:rPr>
-        <w:t xml:space="preserve"> </w:t>
-      </w:r>
-      <w:hyperlink w:anchor="ref_8">
+        <w:t xml:space="preserve">Adversarial alignment does not guarantee action alignment</w:t>
+      </w:r>
+      <w:r>
+        <w:t xml:space="preserve"> </w:t>
+      </w:r>
+      <w:hyperlink w:anchor="ref_9">
         <w:r>
           <w:rPr>
             <w:rStyle w:val="Hyperlink"/>
           </w:rPr>
-          <w:t xml:space="preserve">[8]</w:t>
+          <w:t xml:space="preserve">[9]</w:t>
         </w:r>
       </w:hyperlink>
       <w:r>
-        <w:rPr>
-          <w:rStyle w:val="TeamReview"/>
-        </w:rPr>
-        <w:t xml:space="preserve">; we expect actions to stay</w:t>
-      </w:r>
-      <w:r>
-        <w:rPr>
-          <w:rStyle w:val="TeamReview"/>
-        </w:rPr>
-        <w:t xml:space="preserve"> </w:t>
-      </w:r>
-      <w:r>
-        <w:rPr>
-          <w:rStyle w:val="TeamReview"/>
-        </w:rPr>
-        <w:t xml:space="preserve">readable from arm motion, which per-component errors will test.</w:t>
-      </w:r>
-      <w:r>
-        <w:t xml:space="preserve"> </w:t>
-      </w:r>
-      <w:r>
-        <w:t xml:space="preserve">If the expert</w:t>
-      </w:r>
-      <w:r>
-        <w:t xml:space="preserve"> </w:t>
-      </w:r>
-      <w:r>
-        <w:t xml:space="preserve">fails on a target, we adjust the object or grasp</w:t>
-      </w:r>
-      <w:r>
-        <w:rPr>
-          <w:rStyle w:val="TeamReview"/>
-        </w:rPr>
-        <w:t xml:space="preserve">; if the cube-only policy</w:t>
-      </w:r>
-      <w:r>
-        <w:rPr>
-          <w:rStyle w:val="TeamReview"/>
-        </w:rPr>
-        <w:t xml:space="preserve"> </w:t>
-      </w:r>
-      <w:r>
-        <w:rPr>
-          <w:rStyle w:val="TeamReview"/>
-        </w:rPr>
-        <w:t xml:space="preserve">fails on the cube, we use OCBench’s shorter lite variant</w:t>
-      </w:r>
-      <w:r>
-        <w:t xml:space="preserve">. If alignment hurts, we report negative transfer; optional experiments (D, e) go</w:t>
-      </w:r>
-      <w:r>
-        <w:t xml:space="preserve"> </w:t>
-      </w:r>
-      <w:r>
-        <w:t xml:space="preserve">first if time runs short.</w:t>
+        <w:t xml:space="preserve">;</w:t>
+      </w:r>
+      <w:r>
+        <w:t xml:space="preserve"> </w:t>
+      </w:r>
+      <w:r>
+        <w:t xml:space="preserve">per-component errors test whether actions remain readable from arm motion. If experts</w:t>
+      </w:r>
+      <w:r>
+        <w:t xml:space="preserve"> </w:t>
+      </w:r>
+      <w:r>
+        <w:t xml:space="preserve">fail, adjust objects or grasps; if cube-only ACT fails on the cube, use OCBench’s</w:t>
+      </w:r>
+      <w:r>
+        <w:t xml:space="preserve"> </w:t>
+      </w:r>
+      <w:r>
+        <w:t xml:space="preserve">shorter lite task. We report negative transfer if alignment hurts. If time runs short,</w:t>
+      </w:r>
+      <w:r>
+        <w:t xml:space="preserve"> </w:t>
+      </w:r>
+      <w:r>
+        <w:t xml:space="preserve">drop target D and policy-alignment experiment (f); oracle (d) remains mandatory for R4.</w:t>
       </w:r>
     </w:p>
     <w:p>
@@ -2057,9 +1658,9 @@
         <w:tblLook w:firstRow="1" w:lastRow="0" w:firstColumn="0" w:lastColumn="0" w:noHBand="0" w:noVBand="0" w:val="0020"/>
       </w:tblPr>
       <w:tblGrid>
-        <w:gridCol w:w="1148"/>
-        <w:gridCol w:w="2055"/>
-        <w:gridCol w:w="4715"/>
+        <w:gridCol w:w="1647"/>
+        <w:gridCol w:w="2027"/>
+        <w:gridCol w:w="4245"/>
       </w:tblGrid>
       <w:tr>
         <w:trPr>
@@ -2135,10 +1736,7 @@
               <w:jc w:val="left"/>
             </w:pPr>
             <w:r>
-              <w:rPr>
-                <w:rStyle w:val="TeamName"/>
-              </w:rPr>
-              <w:t xml:space="preserve">MEMBER 1</w:t>
+              <w:t xml:space="preserve">Brik Meza</w:t>
             </w:r>
           </w:p>
         </w:tc>
@@ -2176,10 +1774,7 @@
               <w:jc w:val="left"/>
             </w:pPr>
             <w:r>
-              <w:rPr>
-                <w:rStyle w:val="TeamName"/>
-              </w:rPr>
-              <w:t xml:space="preserve">MEMBER 2</w:t>
+              <w:t xml:space="preserve">Myriam Dardour</w:t>
             </w:r>
           </w:p>
         </w:tc>
@@ -2217,10 +1812,7 @@
               <w:jc w:val="left"/>
             </w:pPr>
             <w:r>
-              <w:rPr>
-                <w:rStyle w:val="TeamName"/>
-              </w:rPr>
-              <w:t xml:space="preserve">MEMBER 3</w:t>
+              <w:t xml:space="preserve">Zheng Ye Zhang</w:t>
             </w:r>
           </w:p>
         </w:tc>
@@ -2258,10 +1850,7 @@
               <w:jc w:val="left"/>
             </w:pPr>
             <w:r>
-              <w:rPr>
-                <w:rStyle w:val="TeamName"/>
-              </w:rPr>
-              <w:t xml:space="preserve">MEMBER 4</w:t>
+              <w:t xml:space="preserve">Gonzalo Millán García</w:t>
             </w:r>
           </w:p>
         </w:tc>
@@ -2293,6 +1882,7 @@
     </w:tbl>
     <w:p>
       <w:pPr>
+        <w:pageBreakBefore/>
         <w:pStyle w:val="BodyText"/>
       </w:pPr>
       <w:r>
@@ -2306,7 +1896,7 @@
         <w:t xml:space="preserve"> </w:t>
       </w:r>
       <w:r>
-        <w:t xml:space="preserve">Codex (OpenAI) and Claude Code</w:t>
+        <w:t xml:space="preserve">ChatGPT (OpenAI) and Claude</w:t>
       </w:r>
       <w:r>
         <w:t xml:space="preserve"> </w:t>
@@ -2330,7 +1920,7 @@
         <w:t xml:space="preserve"> </w:t>
       </w:r>
       <w:r>
-        <w:t xml:space="preserve">the original sources.</w:t>
+        <w:t xml:space="preserve">the sources.</w:t>
       </w:r>
     </w:p>
     <w:p>
@@ -2341,7 +1931,7 @@
         <w:t xml:space="preserve">References</w:t>
       </w:r>
     </w:p>
-    <w:bookmarkStart w:id="17" w:name="ref_1"/>
+    <w:bookmarkStart w:id="18" w:name="ref_1"/>
     <w:p>
       <w:pPr>
         <w:pStyle w:val="Bibliography"/>
@@ -2373,7 +1963,7 @@
       <w:r>
         <w:t xml:space="preserve"> </w:t>
       </w:r>
-      <w:hyperlink r:id="rId16">
+      <w:hyperlink r:id="rId17">
         <w:r>
           <w:rPr>
             <w:rStyle w:val="Hyperlink"/>
@@ -2382,8 +1972,8 @@
         </w:r>
       </w:hyperlink>
     </w:p>
-    <w:bookmarkEnd w:id="17"/>
-    <w:bookmarkStart w:id="19" w:name="ref_2"/>
+    <w:bookmarkEnd w:id="18"/>
+    <w:bookmarkStart w:id="20" w:name="ref_2"/>
     <w:p>
       <w:pPr>
         <w:pStyle w:val="Bibliography"/>
@@ -2447,7 +2037,7 @@
       <w:r>
         <w:t xml:space="preserve"> </w:t>
       </w:r>
-      <w:hyperlink r:id="rId18">
+      <w:hyperlink r:id="rId19">
         <w:r>
           <w:rPr>
             <w:rStyle w:val="Hyperlink"/>
@@ -2456,14 +2046,72 @@
         </w:r>
       </w:hyperlink>
     </w:p>
-    <w:bookmarkEnd w:id="19"/>
-    <w:bookmarkStart w:id="21" w:name="ref_3"/>
+    <w:bookmarkEnd w:id="20"/>
+    <w:bookmarkStart w:id="22" w:name="ref_3"/>
     <w:p>
       <w:pPr>
         <w:pStyle w:val="Bibliography"/>
       </w:pPr>
       <w:r>
         <w:t xml:space="preserve">[3]</w:t>
+      </w:r>
+      <w:r>
+        <w:t xml:space="preserve"> </w:t>
+      </w:r>
+      <w:r>
+        <w:t xml:space="preserve">	</w:t>
+      </w:r>
+      <w:r>
+        <w:t xml:space="preserve">T. Z. Zhao, V. Kumar, S. Levine, and C. Finn,</w:t>
+      </w:r>
+      <w:r>
+        <w:t xml:space="preserve"> </w:t>
+      </w:r>
+      <w:r>
+        <w:t xml:space="preserve">“Learning fine-grained bimanual manipulation with low-cost hardware,”</w:t>
+      </w:r>
+      <w:r>
+        <w:t xml:space="preserve"> </w:t>
+      </w:r>
+      <w:r>
+        <w:t xml:space="preserve">in</w:t>
+      </w:r>
+      <w:r>
+        <w:t xml:space="preserve"> </w:t>
+      </w:r>
+      <w:r>
+        <w:rPr>
+          <w:i/>
+          <w:iCs/>
+        </w:rPr>
+        <w:t xml:space="preserve">Robotics: Science and systems (RSS)</w:t>
+      </w:r>
+      <w:r>
+        <w:t xml:space="preserve">, 2023. doi:</w:t>
+      </w:r>
+      <w:r>
+        <w:t xml:space="preserve"> </w:t>
+      </w:r>
+      <w:hyperlink r:id="rId21">
+        <w:r>
+          <w:rPr>
+            <w:rStyle w:val="Hyperlink"/>
+          </w:rPr>
+          <w:t xml:space="preserve">10.15607/RSS.2023.XIX.016</w:t>
+        </w:r>
+      </w:hyperlink>
+      <w:r>
+        <w:t xml:space="preserve">.</w:t>
+      </w:r>
+    </w:p>
+    <w:bookmarkEnd w:id="22"/>
+    <w:bookmarkStart w:id="24" w:name="ref_4"/>
+    <w:p>
+      <w:pPr>
+        <w:pStyle w:val="Bibliography"/>
+      </w:pPr>
+      <w:r>
+        <w:t xml:space="preserve">[4]</w:t>
       </w:r>
       <w:r>
         <w:t xml:space="preserve"> </w:t>
@@ -2521,23 +2169,23 @@
       <w:r>
         <w:t xml:space="preserve"> </w:t>
       </w:r>
-      <w:hyperlink r:id="rId20">
+      <w:hyperlink r:id="rId23">
         <w:r>
           <w:rPr>
             <w:rStyle w:val="Hyperlink"/>
           </w:rPr>
-          <w:t xml:space="preserve">https://arxiv.org/abs/2505.12705</w:t>
+          <w:t xml:space="preserve">https://proceedings.mlr.press/v305/jang25a.html</w:t>
         </w:r>
       </w:hyperlink>
     </w:p>
-    <w:bookmarkEnd w:id="21"/>
-    <w:bookmarkStart w:id="23" w:name="ref_4"/>
+    <w:bookmarkEnd w:id="24"/>
+    <w:bookmarkStart w:id="26" w:name="ref_5"/>
     <w:p>
       <w:pPr>
         <w:pStyle w:val="Bibliography"/>
       </w:pPr>
       <w:r>
-        <w:t xml:space="preserve">[4]</w:t>
+        <w:t xml:space="preserve">[5]</w:t>
       </w:r>
       <w:r>
         <w:t xml:space="preserve"> </w:t>
@@ -2576,7 +2224,7 @@
       <w:r>
         <w:t xml:space="preserve"> </w:t>
       </w:r>
-      <w:hyperlink r:id="rId22">
+      <w:hyperlink r:id="rId25">
         <w:r>
           <w:rPr>
             <w:rStyle w:val="Hyperlink"/>
@@ -2585,14 +2233,14 @@
         </w:r>
       </w:hyperlink>
     </w:p>
-    <w:bookmarkEnd w:id="23"/>
-    <w:bookmarkStart w:id="25" w:name="ref_5"/>
+    <w:bookmarkEnd w:id="26"/>
+    <w:bookmarkStart w:id="28" w:name="ref_6"/>
     <w:p>
       <w:pPr>
         <w:pStyle w:val="Bibliography"/>
       </w:pPr>
       <w:r>
-        <w:t xml:space="preserve">[5]</w:t>
+        <w:t xml:space="preserve">[6]</w:t>
       </w:r>
       <w:r>
         <w:t xml:space="preserve"> </w:t>
@@ -2631,7 +2279,7 @@
       <w:r>
         <w:t xml:space="preserve"> </w:t>
       </w:r>
-      <w:hyperlink r:id="rId24">
+      <w:hyperlink r:id="rId27">
         <w:r>
           <w:rPr>
             <w:rStyle w:val="Hyperlink"/>
@@ -2640,14 +2288,14 @@
         </w:r>
       </w:hyperlink>
     </w:p>
-    <w:bookmarkEnd w:id="25"/>
-    <w:bookmarkStart w:id="27" w:name="ref_6"/>
+    <w:bookmarkEnd w:id="28"/>
+    <w:bookmarkStart w:id="30" w:name="ref_7"/>
     <w:p>
       <w:pPr>
         <w:pStyle w:val="Bibliography"/>
       </w:pPr>
       <w:r>
-        <w:t xml:space="preserve">[6]</w:t>
+        <w:t xml:space="preserve">[7]</w:t>
       </w:r>
       <w:r>
         <w:t xml:space="preserve"> </w:t>
@@ -2717,7 +2365,7 @@
       <w:r>
         <w:t xml:space="preserve"> </w:t>
       </w:r>
-      <w:hyperlink r:id="rId26">
+      <w:hyperlink r:id="rId29">
         <w:r>
           <w:rPr>
             <w:rStyle w:val="Hyperlink"/>
@@ -2726,14 +2374,14 @@
         </w:r>
       </w:hyperlink>
     </w:p>
-    <w:bookmarkEnd w:id="27"/>
-    <w:bookmarkStart w:id="29" w:name="ref_7"/>
+    <w:bookmarkEnd w:id="30"/>
+    <w:bookmarkStart w:id="32" w:name="ref_8"/>
     <w:p>
       <w:pPr>
         <w:pStyle w:val="Bibliography"/>
       </w:pPr>
       <w:r>
-        <w:t xml:space="preserve">[7]</w:t>
+        <w:t xml:space="preserve">[8]</w:t>
       </w:r>
       <w:r>
         <w:t xml:space="preserve"> </w:t>
@@ -2779,7 +2427,7 @@
       <w:r>
         <w:t xml:space="preserve"> </w:t>
       </w:r>
-      <w:hyperlink r:id="rId28">
+      <w:hyperlink r:id="rId31">
         <w:r>
           <w:rPr>
             <w:rStyle w:val="Hyperlink"/>
@@ -2788,14 +2436,14 @@
         </w:r>
       </w:hyperlink>
     </w:p>
-    <w:bookmarkEnd w:id="29"/>
-    <w:bookmarkStart w:id="31" w:name="ref_8"/>
+    <w:bookmarkEnd w:id="32"/>
+    <w:bookmarkStart w:id="34" w:name="ref_9"/>
     <w:p>
       <w:pPr>
         <w:pStyle w:val="Bibliography"/>
       </w:pPr>
       <w:r>
-        <w:t xml:space="preserve">[8]</w:t>
+        <w:t xml:space="preserve">[9]</w:t>
       </w:r>
       <w:r>
         <w:t xml:space="preserve"> </w:t>
@@ -2829,12 +2477,12 @@
         <w:t xml:space="preserve">Proceedings of the 36th international conference on machine learning</w:t>
       </w:r>
       <w:r>
-        <w:t xml:space="preserve">, in Proceedings of machine learning research, vol. 97. 2019. Available:</w:t>
-      </w:r>
-      <w:r>
-        <w:t xml:space="preserve"> </w:t>
-      </w:r>
-      <w:hyperlink r:id="rId30">
+        <w:t xml:space="preserve">, in Proceedings of machine learning research, vol. 97. 2019, pp. 7523–7532. Available:</w:t>
+      </w:r>
+      <w:r>
+        <w:t xml:space="preserve"> </w:t>
+      </w:r>
+      <w:hyperlink r:id="rId33">
         <w:r>
           <w:rPr>
             <w:rStyle w:val="Hyperlink"/>
@@ -2843,10 +2491,10 @@
         </w:r>
       </w:hyperlink>
     </w:p>
-    <w:bookmarkEnd w:id="31"/>
+    <w:bookmarkEnd w:id="34"/>
     <w:sectPr>
       <w:pgSz w:w="12240" w:h="15840"/>
-      <w:pgMar w:top="1440" w:right="2160" w:bottom="1440" w:left="2160" w:header="720" w:footer="720" w:gutter="0"/>
+      <w:pgMar w:top="1440" w:right="2160" w:bottom="1080" w:left="2160" w:header="720" w:footer="720" w:gutter="0"/>
     </w:sectPr>
   </w:body>
 </w:document>
@@ -2989,7 +2637,7 @@
     <w:qFormat/>
     <w:pPr>
       <w:jc w:val="both"/>
-      <w:spacing w:before="0" w:after="80"/>
+      <w:spacing w:before="0" w:after="20"/>
     </w:pPr>
   </w:style>
   <w:style w:type="paragraph" w:customStyle="1" w:styleId="FirstParagraph">
@@ -3007,7 +2655,7 @@
     <w:qFormat/>
     <w:pPr>
       <w:jc w:val="both"/>
-      <w:spacing w:before="0" w:after="80"/>
+      <w:spacing w:before="0" w:after="0"/>
     </w:pPr>
   </w:style>
   <w:style w:type="paragraph" w:styleId="Title">
@@ -3019,7 +2667,7 @@
     <w:qFormat/>
     <w:rsid w:val="00A10FD9"/>
     <w:pPr>
-      <w:spacing w:before="160" w:after="20"/>
+      <w:spacing w:before="0" w:after="80"/>
       <w:contextualSpacing/>
       <w:jc w:val="center"/>
     </w:pPr>
@@ -3084,6 +2732,7 @@
     <w:next w:val="BodyText"/>
     <w:qFormat/>
     <w:pPr>
+      <w:spacing w:before="0" w:after="80"/>
       <w:keepNext/>
       <w:keepLines/>
     </w:pPr>
@@ -3161,7 +2810,7 @@
     <w:pPr>
       <w:keepNext/>
       <w:keepLines/>
-      <w:spacing w:before="160" w:after="20"/>
+      <w:spacing w:before="80" w:after="20"/>
       <w:outlineLvl w:val="0"/>
     </w:pPr>
     <w:rPr>

</xml_diff>